<commit_message>
v26.35 - Bible : dette v26.29->v26.34 (sections 19 et 20, schema fermes, RPC type_b)
</commit_message>
<xml_diff>
--- a/bible_avigest_v26.docx
+++ b/bible_avigest_v26.docx
@@ -689,7 +689,7 @@
                 <w:bCs/>
                 <w:lang w:val="fr-FR"/>
               </w:rPr>
-              <w:t>APP_VERSION = ‘v26.28’ · CACHE_NAME = ‘avigest-v26-28’</w:t>
+              <w:t>APP_VERSION = ‘v26.34’ · CACHE_NAME = ‘avigest-v26-34’</w:t>
             </w:r>
           </w:p>
         </w:tc>
@@ -1673,7 +1673,7 @@
               <w:rPr>
                 <w:lang w:val="fr-BF"/>
               </w:rPr>
-              <w:t>Tenants — une ligne par ferme cliente</w:t>
+              <w:t xml:space="preserve">Tenants — une ligne par ferme cliente. 14 colonnes, schéma détaillé en §2.4 bis</w:t>
             </w:r>
           </w:p>
         </w:tc>
@@ -2097,7 +2097,7 @@
               <w:rPr>
                 <w:lang w:val="fr-BF"/>
               </w:rPr>
-              <w:t>Verrouillage multi-appareils — RLS désactivée (choix documenté, voir §14)</w:t>
+              <w:t>Verrouillage multi-appareils — RLS ACTIVE (vérifié en base le 22/07/2026, §14.4 ; la Bible indiquait à tort qu’elle était désactivée)</w:t>
             </w:r>
           </w:p>
         </w:tc>
@@ -2216,6 +2216,854 @@
           <w:lang w:val="fr-BF"/>
         </w:rPr>
         <w:t xml:space="preserve"> Tables supprimées en v26.22 : ventes et paiements (ancienne version) existaient en base sans être documentées. Vides (0 ligne), aucune occurrence dans index.html. Modèle incompatible (1 vente = 1 seul produit). Supprimées par la Migration 036, remplacées par commandes + commande_lignes + paiements (nouveau modèle).</w:t>
+      </w:r>
+    </w:p>
+    <w:p>
+      <w:pPr>
+        <w:pStyle w:val="Titre3"/>
+      </w:pPr>
+      <w:r>
+        <w:rPr>
+          <w:b/>
+          <w:bCs/>
+          <w:lang w:val="fr-BF"/>
+        </w:rPr>
+        <w:t xml:space="preserve">2.4 bis — Schéma détaillé de la table fermes</w:t>
+      </w:r>
+    </w:p>
+    <w:p>
+      <w:pPr>
+        <w:pStyle w:val="Corpsdetexte"/>
+      </w:pPr>
+      <w:r>
+        <w:rPr>
+          <w:lang w:val="fr-BF"/>
+        </w:rPr>
+        <w:t xml:space="preserve">Vérifié en base le 23/07/2026 (session v26.35) via information_schema.columns. 14 colonnes. Cette table n’avait jamais été documentée au-delà de son rôle — or elle porte trois colonnes structurantes que la Bible ignorait : plan, nb_batiments et code_acces.</w:t>
+      </w:r>
+    </w:p>
+    <w:tbl>
+      <w:tblPr>
+        <w:tblW w:w="0" w:type="auto"/>
+        <w:tblCellSpacing w:w="15" w:type="dxa"/>
+        <w:tblLook w:val="04A0" w:firstRow="1" w:lastRow="0" w:firstColumn="1" w:lastColumn="0" w:noHBand="0" w:noVBand="1"/>
+      </w:tblPr>
+      <w:tblGrid>
+        <w:gridCol w:w="2400"/>
+        <w:gridCol w:w="2300"/>
+        <w:gridCol w:w="4200"/>
+      </w:tblGrid>
+      <w:tr>
+        <w:trPr>
+          <w:tblCellSpacing w:w="15" w:type="dxa"/>
+        </w:trPr>
+        <w:tc>
+          <w:tcPr>
+            <w:tcW w:w="2400" w:type="dxa"/>
+          </w:tcPr>
+          <w:p>
+            <w:pPr>
+              <w:pStyle w:val="Compact"/>
+            </w:pPr>
+            <w:r>
+              <w:rPr>
+                <w:b/>
+                <w:bCs/>
+                <w:lang w:val="fr-BF"/>
+              </w:rPr>
+              <w:t xml:space="preserve">Colonne</w:t>
+            </w:r>
+          </w:p>
+        </w:tc>
+        <w:tc>
+          <w:tcPr>
+            <w:tcW w:w="2300" w:type="dxa"/>
+          </w:tcPr>
+          <w:p>
+            <w:pPr>
+              <w:pStyle w:val="Compact"/>
+            </w:pPr>
+            <w:r>
+              <w:rPr>
+                <w:b/>
+                <w:bCs/>
+                <w:lang w:val="fr-BF"/>
+              </w:rPr>
+              <w:t xml:space="preserve">Type</w:t>
+            </w:r>
+          </w:p>
+        </w:tc>
+        <w:tc>
+          <w:tcPr>
+            <w:tcW w:w="4200" w:type="dxa"/>
+          </w:tcPr>
+          <w:p>
+            <w:pPr>
+              <w:pStyle w:val="Compact"/>
+            </w:pPr>
+            <w:r>
+              <w:rPr>
+                <w:b/>
+                <w:bCs/>
+                <w:lang w:val="fr-BF"/>
+              </w:rPr>
+              <w:t xml:space="preserve">Rôle / remarque</w:t>
+            </w:r>
+          </w:p>
+        </w:tc>
+      </w:tr>
+      <w:tr>
+        <w:trPr>
+          <w:tblCellSpacing w:w="15" w:type="dxa"/>
+        </w:trPr>
+        <w:tc>
+          <w:tcPr>
+            <w:tcW w:w="2400" w:type="dxa"/>
+          </w:tcPr>
+          <w:p>
+            <w:pPr>
+              <w:pStyle w:val="Compact"/>
+            </w:pPr>
+            <w:r>
+              <w:rPr>
+                <w:lang w:val="fr-BF"/>
+              </w:rPr>
+              <w:t xml:space="preserve">id</w:t>
+            </w:r>
+          </w:p>
+        </w:tc>
+        <w:tc>
+          <w:tcPr>
+            <w:tcW w:w="2300" w:type="dxa"/>
+          </w:tcPr>
+          <w:p>
+            <w:pPr>
+              <w:pStyle w:val="Compact"/>
+            </w:pPr>
+            <w:r>
+              <w:rPr>
+                <w:lang w:val="fr-BF"/>
+              </w:rPr>
+              <w:t xml:space="preserve">uuid NOT NULL</w:t>
+            </w:r>
+          </w:p>
+        </w:tc>
+        <w:tc>
+          <w:tcPr>
+            <w:tcW w:w="4200" w:type="dxa"/>
+          </w:tcPr>
+          <w:p>
+            <w:pPr>
+              <w:pStyle w:val="Compact"/>
+            </w:pPr>
+            <w:r>
+              <w:rPr>
+                <w:lang w:val="fr-BF"/>
+              </w:rPr>
+              <w:t xml:space="preserve">Clé primaire, default uuid_generate_v4(). C’est la valeur portée par le header x-ferme-id.</w:t>
+            </w:r>
+          </w:p>
+        </w:tc>
+      </w:tr>
+      <w:tr>
+        <w:trPr>
+          <w:tblCellSpacing w:w="15" w:type="dxa"/>
+        </w:trPr>
+        <w:tc>
+          <w:tcPr>
+            <w:tcW w:w="2400" w:type="dxa"/>
+          </w:tcPr>
+          <w:p>
+            <w:pPr>
+              <w:pStyle w:val="Compact"/>
+            </w:pPr>
+            <w:r>
+              <w:rPr>
+                <w:lang w:val="fr-BF"/>
+              </w:rPr>
+              <w:t xml:space="preserve">nom</w:t>
+            </w:r>
+          </w:p>
+        </w:tc>
+        <w:tc>
+          <w:tcPr>
+            <w:tcW w:w="2300" w:type="dxa"/>
+          </w:tcPr>
+          <w:p>
+            <w:pPr>
+              <w:pStyle w:val="Compact"/>
+            </w:pPr>
+            <w:r>
+              <w:rPr>
+                <w:lang w:val="fr-BF"/>
+              </w:rPr>
+              <w:t xml:space="preserve">text NOT NULL</w:t>
+            </w:r>
+          </w:p>
+        </w:tc>
+        <w:tc>
+          <w:tcPr>
+            <w:tcW w:w="4200" w:type="dxa"/>
+          </w:tcPr>
+          <w:p>
+            <w:pPr>
+              <w:pStyle w:val="Compact"/>
+            </w:pPr>
+            <w:r>
+              <w:rPr>
+                <w:lang w:val="fr-BF"/>
+              </w:rPr>
+              <w:t xml:space="preserve">Nom technique du tenant (REVAGRO, ALIRAH2026).</w:t>
+            </w:r>
+          </w:p>
+        </w:tc>
+      </w:tr>
+      <w:tr>
+        <w:trPr>
+          <w:tblCellSpacing w:w="15" w:type="dxa"/>
+        </w:trPr>
+        <w:tc>
+          <w:tcPr>
+            <w:tcW w:w="2400" w:type="dxa"/>
+          </w:tcPr>
+          <w:p>
+            <w:pPr>
+              <w:pStyle w:val="Compact"/>
+            </w:pPr>
+            <w:r>
+              <w:rPr>
+                <w:lang w:val="fr-BF"/>
+              </w:rPr>
+              <w:t xml:space="preserve">proprietaire</w:t>
+            </w:r>
+          </w:p>
+        </w:tc>
+        <w:tc>
+          <w:tcPr>
+            <w:tcW w:w="2300" w:type="dxa"/>
+          </w:tcPr>
+          <w:p>
+            <w:pPr>
+              <w:pStyle w:val="Compact"/>
+            </w:pPr>
+            <w:r>
+              <w:rPr>
+                <w:lang w:val="fr-BF"/>
+              </w:rPr>
+              <w:t xml:space="preserve">text NOT NULL</w:t>
+            </w:r>
+          </w:p>
+        </w:tc>
+        <w:tc>
+          <w:tcPr>
+            <w:tcW w:w="4200" w:type="dxa"/>
+          </w:tcPr>
+          <w:p>
+            <w:pPr>
+              <w:pStyle w:val="Compact"/>
+            </w:pPr>
+            <w:r>
+              <w:rPr>
+                <w:lang w:val="fr-BF"/>
+              </w:rPr>
+              <w:t xml:space="preserve">Nom du propriétaire de la ferme.</w:t>
+            </w:r>
+          </w:p>
+        </w:tc>
+      </w:tr>
+      <w:tr>
+        <w:trPr>
+          <w:tblCellSpacing w:w="15" w:type="dxa"/>
+        </w:trPr>
+        <w:tc>
+          <w:tcPr>
+            <w:tcW w:w="2400" w:type="dxa"/>
+          </w:tcPr>
+          <w:p>
+            <w:pPr>
+              <w:pStyle w:val="Compact"/>
+            </w:pPr>
+            <w:r>
+              <w:rPr>
+                <w:lang w:val="fr-BF"/>
+              </w:rPr>
+              <w:t xml:space="preserve">ville</w:t>
+            </w:r>
+          </w:p>
+        </w:tc>
+        <w:tc>
+          <w:tcPr>
+            <w:tcW w:w="2300" w:type="dxa"/>
+          </w:tcPr>
+          <w:p>
+            <w:pPr>
+              <w:pStyle w:val="Compact"/>
+            </w:pPr>
+            <w:r>
+              <w:rPr>
+                <w:lang w:val="fr-BF"/>
+              </w:rPr>
+              <w:t xml:space="preserve">text</w:t>
+            </w:r>
+          </w:p>
+        </w:tc>
+        <w:tc>
+          <w:tcPr>
+            <w:tcW w:w="4200" w:type="dxa"/>
+          </w:tcPr>
+          <w:p>
+            <w:pPr>
+              <w:pStyle w:val="Compact"/>
+            </w:pPr>
+            <w:r>
+              <w:rPr>
+                <w:lang w:val="fr-BF"/>
+              </w:rPr>
+              <w:t xml:space="preserve">Default ‘Ouagadougou’.</w:t>
+            </w:r>
+          </w:p>
+        </w:tc>
+      </w:tr>
+      <w:tr>
+        <w:trPr>
+          <w:tblCellSpacing w:w="15" w:type="dxa"/>
+        </w:trPr>
+        <w:tc>
+          <w:tcPr>
+            <w:tcW w:w="2400" w:type="dxa"/>
+          </w:tcPr>
+          <w:p>
+            <w:pPr>
+              <w:pStyle w:val="Compact"/>
+            </w:pPr>
+            <w:r>
+              <w:rPr>
+                <w:lang w:val="fr-BF"/>
+              </w:rPr>
+              <w:t xml:space="preserve">pays</w:t>
+            </w:r>
+          </w:p>
+        </w:tc>
+        <w:tc>
+          <w:tcPr>
+            <w:tcW w:w="2300" w:type="dxa"/>
+          </w:tcPr>
+          <w:p>
+            <w:pPr>
+              <w:pStyle w:val="Compact"/>
+            </w:pPr>
+            <w:r>
+              <w:rPr>
+                <w:lang w:val="fr-BF"/>
+              </w:rPr>
+              <w:t xml:space="preserve">text</w:t>
+            </w:r>
+          </w:p>
+        </w:tc>
+        <w:tc>
+          <w:tcPr>
+            <w:tcW w:w="4200" w:type="dxa"/>
+          </w:tcPr>
+          <w:p>
+            <w:pPr>
+              <w:pStyle w:val="Compact"/>
+            </w:pPr>
+            <w:r>
+              <w:rPr>
+                <w:lang w:val="fr-BF"/>
+              </w:rPr>
+              <w:t xml:space="preserve">Default ‘Burkina Faso’.</w:t>
+            </w:r>
+          </w:p>
+        </w:tc>
+      </w:tr>
+      <w:tr>
+        <w:trPr>
+          <w:tblCellSpacing w:w="15" w:type="dxa"/>
+        </w:trPr>
+        <w:tc>
+          <w:tcPr>
+            <w:tcW w:w="2400" w:type="dxa"/>
+          </w:tcPr>
+          <w:p>
+            <w:pPr>
+              <w:pStyle w:val="Compact"/>
+            </w:pPr>
+            <w:r>
+              <w:rPr>
+                <w:lang w:val="fr-BF"/>
+              </w:rPr>
+              <w:t xml:space="preserve">telephone</w:t>
+            </w:r>
+          </w:p>
+        </w:tc>
+        <w:tc>
+          <w:tcPr>
+            <w:tcW w:w="2300" w:type="dxa"/>
+          </w:tcPr>
+          <w:p>
+            <w:pPr>
+              <w:pStyle w:val="Compact"/>
+            </w:pPr>
+            <w:r>
+              <w:rPr>
+                <w:lang w:val="fr-BF"/>
+              </w:rPr>
+              <w:t xml:space="preserve">text</w:t>
+            </w:r>
+          </w:p>
+        </w:tc>
+        <w:tc>
+          <w:tcPr>
+            <w:tcW w:w="4200" w:type="dxa"/>
+          </w:tcPr>
+          <w:p>
+            <w:pPr>
+              <w:pStyle w:val="Compact"/>
+            </w:pPr>
+            <w:r>
+              <w:rPr>
+                <w:lang w:val="fr-BF"/>
+              </w:rPr>
+              <w:t xml:space="preserve">Utilisé sur les reçus de paiement (§19).</w:t>
+            </w:r>
+          </w:p>
+        </w:tc>
+      </w:tr>
+      <w:tr>
+        <w:trPr>
+          <w:tblCellSpacing w:w="15" w:type="dxa"/>
+        </w:trPr>
+        <w:tc>
+          <w:tcPr>
+            <w:tcW w:w="2400" w:type="dxa"/>
+          </w:tcPr>
+          <w:p>
+            <w:pPr>
+              <w:pStyle w:val="Compact"/>
+            </w:pPr>
+            <w:r>
+              <w:rPr>
+                <w:lang w:val="fr-BF"/>
+              </w:rPr>
+              <w:t xml:space="preserve">email</w:t>
+            </w:r>
+          </w:p>
+        </w:tc>
+        <w:tc>
+          <w:tcPr>
+            <w:tcW w:w="2300" w:type="dxa"/>
+          </w:tcPr>
+          <w:p>
+            <w:pPr>
+              <w:pStyle w:val="Compact"/>
+            </w:pPr>
+            <w:r>
+              <w:rPr>
+                <w:lang w:val="fr-BF"/>
+              </w:rPr>
+              <w:t xml:space="preserve">text</w:t>
+            </w:r>
+          </w:p>
+        </w:tc>
+        <w:tc>
+          <w:tcPr>
+            <w:tcW w:w="4200" w:type="dxa"/>
+          </w:tcPr>
+          <w:p>
+            <w:pPr>
+              <w:pStyle w:val="Compact"/>
+            </w:pPr>
+            <w:r>
+              <w:rPr>
+                <w:lang w:val="fr-BF"/>
+              </w:rPr>
+              <w:t xml:space="preserve">Nullable, non utilisé à ce jour.</w:t>
+            </w:r>
+          </w:p>
+        </w:tc>
+      </w:tr>
+      <w:tr>
+        <w:trPr>
+          <w:tblCellSpacing w:w="15" w:type="dxa"/>
+        </w:trPr>
+        <w:tc>
+          <w:tcPr>
+            <w:tcW w:w="2400" w:type="dxa"/>
+          </w:tcPr>
+          <w:p>
+            <w:pPr>
+              <w:pStyle w:val="Compact"/>
+            </w:pPr>
+            <w:r>
+              <w:rPr>
+                <w:lang w:val="fr-BF"/>
+              </w:rPr>
+              <w:t xml:space="preserve">plan</w:t>
+            </w:r>
+          </w:p>
+        </w:tc>
+        <w:tc>
+          <w:tcPr>
+            <w:tcW w:w="2300" w:type="dxa"/>
+          </w:tcPr>
+          <w:p>
+            <w:pPr>
+              <w:pStyle w:val="Compact"/>
+            </w:pPr>
+            <w:r>
+              <w:rPr>
+                <w:lang w:val="fr-BF"/>
+              </w:rPr>
+              <w:t xml:space="preserve">text</w:t>
+            </w:r>
+          </w:p>
+        </w:tc>
+        <w:tc>
+          <w:tcPr>
+            <w:tcW w:w="4200" w:type="dxa"/>
+          </w:tcPr>
+          <w:p>
+            <w:pPr>
+              <w:pStyle w:val="Compact"/>
+            </w:pPr>
+            <w:r>
+              <w:rPr>
+                <w:lang w:val="fr-BF"/>
+              </w:rPr>
+              <w:t xml:space="preserve">Default ‘FREE’. ⚠️ Socle du modèle tarifaire SaaS — la colonne existe mais n’est exploitée par aucun écran.</w:t>
+            </w:r>
+          </w:p>
+        </w:tc>
+      </w:tr>
+      <w:tr>
+        <w:trPr>
+          <w:tblCellSpacing w:w="15" w:type="dxa"/>
+        </w:trPr>
+        <w:tc>
+          <w:tcPr>
+            <w:tcW w:w="2400" w:type="dxa"/>
+          </w:tcPr>
+          <w:p>
+            <w:pPr>
+              <w:pStyle w:val="Compact"/>
+            </w:pPr>
+            <w:r>
+              <w:rPr>
+                <w:lang w:val="fr-BF"/>
+              </w:rPr>
+              <w:t xml:space="preserve">nb_batiments</w:t>
+            </w:r>
+          </w:p>
+        </w:tc>
+        <w:tc>
+          <w:tcPr>
+            <w:tcW w:w="2300" w:type="dxa"/>
+          </w:tcPr>
+          <w:p>
+            <w:pPr>
+              <w:pStyle w:val="Compact"/>
+            </w:pPr>
+            <w:r>
+              <w:rPr>
+                <w:lang w:val="fr-BF"/>
+              </w:rPr>
+              <w:t xml:space="preserve">integer</w:t>
+            </w:r>
+          </w:p>
+        </w:tc>
+        <w:tc>
+          <w:tcPr>
+            <w:tcW w:w="4200" w:type="dxa"/>
+          </w:tcPr>
+          <w:p>
+            <w:pPr>
+              <w:pStyle w:val="Compact"/>
+            </w:pPr>
+            <w:r>
+              <w:rPr>
+                <w:lang w:val="fr-BF"/>
+              </w:rPr>
+              <w:t xml:space="preserve">Default 6. Nombre de poulaillers alloués au tenant. Même remarque que plan.</w:t>
+            </w:r>
+          </w:p>
+        </w:tc>
+      </w:tr>
+      <w:tr>
+        <w:trPr>
+          <w:tblCellSpacing w:w="15" w:type="dxa"/>
+        </w:trPr>
+        <w:tc>
+          <w:tcPr>
+            <w:tcW w:w="2400" w:type="dxa"/>
+          </w:tcPr>
+          <w:p>
+            <w:pPr>
+              <w:pStyle w:val="Compact"/>
+            </w:pPr>
+            <w:r>
+              <w:rPr>
+                <w:lang w:val="fr-BF"/>
+              </w:rPr>
+              <w:t xml:space="preserve">actif</w:t>
+            </w:r>
+          </w:p>
+        </w:tc>
+        <w:tc>
+          <w:tcPr>
+            <w:tcW w:w="2300" w:type="dxa"/>
+          </w:tcPr>
+          <w:p>
+            <w:pPr>
+              <w:pStyle w:val="Compact"/>
+            </w:pPr>
+            <w:r>
+              <w:rPr>
+                <w:lang w:val="fr-BF"/>
+              </w:rPr>
+              <w:t xml:space="preserve">boolean</w:t>
+            </w:r>
+          </w:p>
+        </w:tc>
+        <w:tc>
+          <w:tcPr>
+            <w:tcW w:w="4200" w:type="dxa"/>
+          </w:tcPr>
+          <w:p>
+            <w:pPr>
+              <w:pStyle w:val="Compact"/>
+            </w:pPr>
+            <w:r>
+              <w:rPr>
+                <w:lang w:val="fr-BF"/>
+              </w:rPr>
+              <w:t xml:space="preserve">Default true.</w:t>
+            </w:r>
+          </w:p>
+        </w:tc>
+      </w:tr>
+      <w:tr>
+        <w:trPr>
+          <w:tblCellSpacing w:w="15" w:type="dxa"/>
+        </w:trPr>
+        <w:tc>
+          <w:tcPr>
+            <w:tcW w:w="2400" w:type="dxa"/>
+          </w:tcPr>
+          <w:p>
+            <w:pPr>
+              <w:pStyle w:val="Compact"/>
+            </w:pPr>
+            <w:r>
+              <w:rPr>
+                <w:lang w:val="fr-BF"/>
+              </w:rPr>
+              <w:t xml:space="preserve">created_at</w:t>
+            </w:r>
+          </w:p>
+        </w:tc>
+        <w:tc>
+          <w:tcPr>
+            <w:tcW w:w="2300" w:type="dxa"/>
+          </w:tcPr>
+          <w:p>
+            <w:pPr>
+              <w:pStyle w:val="Compact"/>
+            </w:pPr>
+            <w:r>
+              <w:rPr>
+                <w:lang w:val="fr-BF"/>
+              </w:rPr>
+              <w:t xml:space="preserve">timestamptz</w:t>
+            </w:r>
+          </w:p>
+        </w:tc>
+        <w:tc>
+          <w:tcPr>
+            <w:tcW w:w="4200" w:type="dxa"/>
+          </w:tcPr>
+          <w:p>
+            <w:pPr>
+              <w:pStyle w:val="Compact"/>
+            </w:pPr>
+            <w:r>
+              <w:rPr>
+                <w:lang w:val="fr-BF"/>
+              </w:rPr>
+              <w:t xml:space="preserve">Default now().</w:t>
+            </w:r>
+          </w:p>
+        </w:tc>
+      </w:tr>
+      <w:tr>
+        <w:trPr>
+          <w:tblCellSpacing w:w="15" w:type="dxa"/>
+        </w:trPr>
+        <w:tc>
+          <w:tcPr>
+            <w:tcW w:w="2400" w:type="dxa"/>
+          </w:tcPr>
+          <w:p>
+            <w:pPr>
+              <w:pStyle w:val="Compact"/>
+            </w:pPr>
+            <w:r>
+              <w:rPr>
+                <w:lang w:val="fr-BF"/>
+              </w:rPr>
+              <w:t xml:space="preserve">updated_at</w:t>
+            </w:r>
+          </w:p>
+        </w:tc>
+        <w:tc>
+          <w:tcPr>
+            <w:tcW w:w="2300" w:type="dxa"/>
+          </w:tcPr>
+          <w:p>
+            <w:pPr>
+              <w:pStyle w:val="Compact"/>
+            </w:pPr>
+            <w:r>
+              <w:rPr>
+                <w:lang w:val="fr-BF"/>
+              </w:rPr>
+              <w:t xml:space="preserve">timestamptz</w:t>
+            </w:r>
+          </w:p>
+        </w:tc>
+        <w:tc>
+          <w:tcPr>
+            <w:tcW w:w="4200" w:type="dxa"/>
+          </w:tcPr>
+          <w:p>
+            <w:pPr>
+              <w:pStyle w:val="Compact"/>
+            </w:pPr>
+            <w:r>
+              <w:rPr>
+                <w:lang w:val="fr-BF"/>
+              </w:rPr>
+              <w:t xml:space="preserve">Default now().</w:t>
+            </w:r>
+          </w:p>
+        </w:tc>
+      </w:tr>
+      <w:tr>
+        <w:trPr>
+          <w:tblCellSpacing w:w="15" w:type="dxa"/>
+        </w:trPr>
+        <w:tc>
+          <w:tcPr>
+            <w:tcW w:w="2400" w:type="dxa"/>
+          </w:tcPr>
+          <w:p>
+            <w:pPr>
+              <w:pStyle w:val="Compact"/>
+            </w:pPr>
+            <w:r>
+              <w:rPr>
+                <w:lang w:val="fr-BF"/>
+              </w:rPr>
+              <w:t xml:space="preserve">code_acces</w:t>
+            </w:r>
+          </w:p>
+        </w:tc>
+        <w:tc>
+          <w:tcPr>
+            <w:tcW w:w="2300" w:type="dxa"/>
+          </w:tcPr>
+          <w:p>
+            <w:pPr>
+              <w:pStyle w:val="Compact"/>
+            </w:pPr>
+            <w:r>
+              <w:rPr>
+                <w:lang w:val="fr-BF"/>
+              </w:rPr>
+              <w:t xml:space="preserve">text</w:t>
+            </w:r>
+          </w:p>
+        </w:tc>
+        <w:tc>
+          <w:tcPr>
+            <w:tcW w:w="4200" w:type="dxa"/>
+          </w:tcPr>
+          <w:p>
+            <w:pPr>
+              <w:pStyle w:val="Compact"/>
+            </w:pPr>
+            <w:r>
+              <w:rPr>
+                <w:lang w:val="fr-BF"/>
+              </w:rPr>
+              <w:t xml:space="preserve">⚠️ Colonne du login par code ferme (écran-code-ferme). C’est elle que protège la policy lecture_publique_code_acces (SELECT, qual=true, rôles anon+authenticated) documentée en §14.4 — policy volontaire, à conserver.</w:t>
+            </w:r>
+          </w:p>
+        </w:tc>
+      </w:tr>
+      <w:tr>
+        <w:trPr>
+          <w:tblCellSpacing w:w="15" w:type="dxa"/>
+        </w:trPr>
+        <w:tc>
+          <w:tcPr>
+            <w:tcW w:w="2400" w:type="dxa"/>
+          </w:tcPr>
+          <w:p>
+            <w:pPr>
+              <w:pStyle w:val="Compact"/>
+            </w:pPr>
+            <w:r>
+              <w:rPr>
+                <w:lang w:val="fr-BF"/>
+              </w:rPr>
+              <w:t xml:space="preserve">nom_commercial</w:t>
+            </w:r>
+          </w:p>
+        </w:tc>
+        <w:tc>
+          <w:tcPr>
+            <w:tcW w:w="2300" w:type="dxa"/>
+          </w:tcPr>
+          <w:p>
+            <w:pPr>
+              <w:pStyle w:val="Compact"/>
+            </w:pPr>
+            <w:r>
+              <w:rPr>
+                <w:lang w:val="fr-BF"/>
+              </w:rPr>
+              <w:t xml:space="preserve">text</w:t>
+            </w:r>
+          </w:p>
+        </w:tc>
+        <w:tc>
+          <w:tcPr>
+            <w:tcW w:w="4200" w:type="dxa"/>
+          </w:tcPr>
+          <w:p>
+            <w:pPr>
+              <w:pStyle w:val="Compact"/>
+            </w:pPr>
+            <w:r>
+              <w:rPr>
+                <w:lang w:val="fr-BF"/>
+              </w:rPr>
+              <w:t xml:space="preserve">Ajoutée par la Migration 047 (v26.34). Nom affiché en tête des reçus de paiement, distinct du nom technique. Ex. REVAGRO → « Kalycoq ». Saisi via l’écran Paramètres (§20).</w:t>
+            </w:r>
+          </w:p>
+        </w:tc>
+      </w:tr>
+    </w:tbl>
+    <w:p>
+      <w:pPr>
+        <w:pStyle w:val="Corpsdetexte"/>
+      </w:pPr>
+      <w:r>
+        <w:rPr>
+          <w:lang w:val="fr-BF"/>
+        </w:rPr>
+        <w:t xml:space="preserve">💡 En clair : cette table, c’est le registre des clients d’AviGest — une ligne par ferme. On y a découvert deux cases déjà prévues pour la vente d’abonnements (plan et nombre de poulaillers autorisés) qui ne servent encore à rien : le terrain est déjà préparé pour le passage en SaaS, il reste à construire dessus.</w:t>
       </w:r>
     </w:p>
     <w:p>
@@ -4330,7 +5178,7 @@
           <w:bCs/>
           <w:lang w:val="fr-FR"/>
         </w:rPr>
-        <w:t>Bug cosmétique (v26.17, toujours non résolu, priorité moyenne)</w:t>
+        <w:t>Bug cosmétique (v26.17) — ✅ FERMÉ v26.30</w:t>
       </w:r>
       <w:r>
         <w:rPr>
@@ -4402,7 +5250,7 @@
         <w:rPr>
           <w:lang w:val="fr-FR"/>
         </w:rPr>
-        <w:t xml:space="preserve">. Correctif prêt (retrait de </w:t>
+        <w:t xml:space="preserve">. Correctif appliqué en v26.30 (retrait de </w:t>
       </w:r>
       <w:r>
         <w:rPr>
@@ -4441,10 +5289,10 @@
         <w:rPr>
           <w:lang w:val="fr-FR"/>
         </w:rPr>
-        <w:t xml:space="preserve"> gère déjà le gras) — non encore appliqué. </w:t>
-      </w:r>
-      <w:r>
-        <w:t>Estimé 5 minutes.</w:t>
+        <w:t xml:space="preserve"> gère déjà le gras). </w:t>
+      </w:r>
+      <w:r>
+        <w:t xml:space="preserve">⚠️ Leçon : DEUX balises étaient en cause, pas une seule — le premier correctif partiel n’avait donc rien changé à l’écran. Toujours compter les occurrences avant de conclure qu’un correctif est complet.</w:t>
       </w:r>
     </w:p>
     <w:p>
@@ -4612,6 +5460,801 @@
           <w:lang w:val="fr-FR"/>
         </w:rPr>
         <w:t xml:space="preserve">  l'ancien CASE (nom produit) si NULL</w:t>
+      </w:r>
+    </w:p>
+    <w:p>
+      <w:pPr>
+        <w:pStyle w:val="Corpsdetexte"/>
+      </w:pPr>
+      <w:r>
+        <w:rPr>
+          <w:b/>
+          <w:bCs/>
+          <w:lang w:val="fr-BF"/>
+        </w:rPr>
+        <w:t xml:space="preserve">RPC imputer_stock_type_b — sortie de stock sans écriture comptable</w:t>
+      </w:r>
+    </w:p>
+    <w:p>
+      <w:pPr>
+        <w:pStyle w:val="Corpsdetexte"/>
+      </w:pPr>
+      <w:r>
+        <w:rPr>
+          <w:lang w:val="fr-BF"/>
+        </w:rPr>
+        <w:t xml:space="preserve">Documentée en v26.35. Cette RPC existait en base depuis plusieurs sessions sans figurer dans la Bible. Schéma relevé directement via pg_get_functiondef() le 23/07/2026.</w:t>
+      </w:r>
+    </w:p>
+    <w:p>
+      <w:pPr>
+        <w:pStyle w:val="SourceCode"/>
+      </w:pPr>
+      <w:r>
+        <w:rPr>
+          <w:rStyle w:val="VerbatimChar"/>
+          <w:lang w:val="fr-BF"/>
+        </w:rPr>
+        <w:t xml:space="preserve">imputer_stock_type_b(</w:t>
+      </w:r>
+      <w:r>
+        <w:rPr>
+          <w:lang w:val="fr-BF"/>
+        </w:rPr>
+        <w:br/>
+      </w:r>
+      <w:r>
+        <w:rPr>
+          <w:rStyle w:val="VerbatimChar"/>
+          <w:lang w:val="fr-BF"/>
+        </w:rPr>
+        <w:t xml:space="preserve">  p_bande_id     uuid,</w:t>
+      </w:r>
+      <w:r>
+        <w:rPr>
+          <w:lang w:val="fr-BF"/>
+        </w:rPr>
+        <w:br/>
+      </w:r>
+      <w:r>
+        <w:rPr>
+          <w:rStyle w:val="VerbatimChar"/>
+          <w:lang w:val="fr-BF"/>
+        </w:rPr>
+        <w:t xml:space="preserve">  p_type_produit text,</w:t>
+      </w:r>
+      <w:r>
+        <w:rPr>
+          <w:lang w:val="fr-BF"/>
+        </w:rPr>
+        <w:br/>
+      </w:r>
+      <w:r>
+        <w:rPr>
+          <w:rStyle w:val="VerbatimChar"/>
+          <w:lang w:val="fr-BF"/>
+        </w:rPr>
+        <w:t xml:space="preserve">  p_quantite,</w:t>
+      </w:r>
+      <w:r>
+        <w:rPr>
+          <w:lang w:val="fr-BF"/>
+        </w:rPr>
+        <w:br/>
+      </w:r>
+      <w:r>
+        <w:rPr>
+          <w:rStyle w:val="VerbatimChar"/>
+          <w:lang w:val="fr-BF"/>
+        </w:rPr>
+        <w:t xml:space="preserve">  p_session,</w:t>
+      </w:r>
+      <w:r>
+        <w:rPr>
+          <w:lang w:val="fr-BF"/>
+        </w:rPr>
+        <w:br/>
+      </w:r>
+      <w:r>
+        <w:rPr>
+          <w:rStyle w:val="VerbatimChar"/>
+          <w:lang w:val="fr-BF"/>
+        </w:rPr>
+        <w:t xml:space="preserve">  p_note</w:t>
+      </w:r>
+      <w:r>
+        <w:rPr>
+          <w:lang w:val="fr-BF"/>
+        </w:rPr>
+        <w:br/>
+      </w:r>
+      <w:r>
+        <w:rPr>
+          <w:rStyle w:val="VerbatimChar"/>
+          <w:lang w:val="fr-BF"/>
+        </w:rPr>
+        <w:t xml:space="preserve">) RETURNS jsonb</w:t>
+      </w:r>
+      <w:r>
+        <w:rPr>
+          <w:lang w:val="fr-BF"/>
+        </w:rPr>
+        <w:br/>
+      </w:r>
+      <w:r>
+        <w:rPr>
+          <w:rStyle w:val="VerbatimChar"/>
+          <w:lang w:val="fr-BF"/>
+        </w:rPr>
+        <w:t xml:space="preserve">LANGUAGE plpgsql SECURITY DEFINER</w:t>
+      </w:r>
+    </w:p>
+    <w:p>
+      <w:pPr>
+        <w:pStyle w:val="Corpsdetexte"/>
+      </w:pPr>
+      <w:r>
+        <w:rPr>
+          <w:lang w:val="fr-BF"/>
+        </w:rPr>
+        <w:t xml:space="preserve">⚠️ Correction d’une erreur de brief : un brief de reprise antérieur annonçait la signature (p_lot_id, p_bande_id, p_quantite, p_session, p_note). C’est FAUX. Le premier paramètre est p_bande_id et le second p_type_produit — il n’existe aucun p_lot_id. Application directe de la règle absolue n°1 : diagnostiquer en base avant de coder.</w:t>
+      </w:r>
+    </w:p>
+    <w:p>
+      <w:pPr>
+        <w:pStyle w:val="Corpsdetexte"/>
+      </w:pPr>
+      <w:r>
+        <w:rPr>
+          <w:b/>
+          <w:bCs/>
+          <w:lang w:val="fr-BF"/>
+        </w:rPr>
+        <w:t xml:space="preserve">Paramètres :</w:t>
+      </w:r>
+    </w:p>
+    <w:tbl>
+      <w:tblPr>
+        <w:tblW w:w="0" w:type="auto"/>
+        <w:tblCellSpacing w:w="15" w:type="dxa"/>
+        <w:tblLook w:val="04A0" w:firstRow="1" w:lastRow="0" w:firstColumn="1" w:lastColumn="0" w:noHBand="0" w:noVBand="1"/>
+      </w:tblPr>
+      <w:tblGrid>
+        <w:gridCol w:w="3000"/>
+        <w:gridCol w:w="5900"/>
+      </w:tblGrid>
+      <w:tr>
+        <w:trPr>
+          <w:tblCellSpacing w:w="15" w:type="dxa"/>
+        </w:trPr>
+        <w:tc>
+          <w:tcPr>
+            <w:tcW w:w="3000" w:type="dxa"/>
+          </w:tcPr>
+          <w:p>
+            <w:pPr>
+              <w:pStyle w:val="Compact"/>
+            </w:pPr>
+            <w:r>
+              <w:rPr>
+                <w:b/>
+                <w:bCs/>
+                <w:lang w:val="fr-BF"/>
+              </w:rPr>
+              <w:t xml:space="preserve">Paramètre</w:t>
+            </w:r>
+          </w:p>
+        </w:tc>
+        <w:tc>
+          <w:tcPr>
+            <w:tcW w:w="5900" w:type="dxa"/>
+          </w:tcPr>
+          <w:p>
+            <w:pPr>
+              <w:pStyle w:val="Compact"/>
+            </w:pPr>
+            <w:r>
+              <w:rPr>
+                <w:b/>
+                <w:bCs/>
+                <w:lang w:val="fr-BF"/>
+              </w:rPr>
+              <w:t xml:space="preserve">Rôle</w:t>
+            </w:r>
+          </w:p>
+        </w:tc>
+      </w:tr>
+      <w:tr>
+        <w:trPr>
+          <w:tblCellSpacing w:w="15" w:type="dxa"/>
+        </w:trPr>
+        <w:tc>
+          <w:tcPr>
+            <w:tcW w:w="3000" w:type="dxa"/>
+          </w:tcPr>
+          <w:p>
+            <w:pPr>
+              <w:pStyle w:val="Compact"/>
+            </w:pPr>
+            <w:r>
+              <w:rPr>
+                <w:lang w:val="fr-BF"/>
+              </w:rPr>
+              <w:t xml:space="preserve">p_bande_id uuid</w:t>
+            </w:r>
+          </w:p>
+        </w:tc>
+        <w:tc>
+          <w:tcPr>
+            <w:tcW w:w="5900" w:type="dxa"/>
+          </w:tcPr>
+          <w:p>
+            <w:pPr>
+              <w:pStyle w:val="Compact"/>
+            </w:pPr>
+            <w:r>
+              <w:rPr>
+                <w:lang w:val="fr-BF"/>
+              </w:rPr>
+              <w:t xml:space="preserve">Bande concernée par la sortie de stock.</w:t>
+            </w:r>
+          </w:p>
+        </w:tc>
+      </w:tr>
+      <w:tr>
+        <w:trPr>
+          <w:tblCellSpacing w:w="15" w:type="dxa"/>
+        </w:trPr>
+        <w:tc>
+          <w:tcPr>
+            <w:tcW w:w="3000" w:type="dxa"/>
+          </w:tcPr>
+          <w:p>
+            <w:pPr>
+              <w:pStyle w:val="Compact"/>
+            </w:pPr>
+            <w:r>
+              <w:rPr>
+                <w:lang w:val="fr-BF"/>
+              </w:rPr>
+              <w:t xml:space="preserve">p_type_produit text</w:t>
+            </w:r>
+          </w:p>
+        </w:tc>
+        <w:tc>
+          <w:tcPr>
+            <w:tcW w:w="5900" w:type="dxa"/>
+          </w:tcPr>
+          <w:p>
+            <w:pPr>
+              <w:pStyle w:val="Compact"/>
+            </w:pPr>
+            <w:r>
+              <w:rPr>
+                <w:lang w:val="fr-BF"/>
+              </w:rPr>
+              <w:t xml:space="preserve">⚠️ Ce n’est PAS un identifiant de lot. C’est un fragment du nom du produit. La RPC cherche elle-même le lot avec LOWER(produit) LIKE ‘%…%’.</w:t>
+            </w:r>
+          </w:p>
+        </w:tc>
+      </w:tr>
+      <w:tr>
+        <w:trPr>
+          <w:tblCellSpacing w:w="15" w:type="dxa"/>
+        </w:trPr>
+        <w:tc>
+          <w:tcPr>
+            <w:tcW w:w="3000" w:type="dxa"/>
+          </w:tcPr>
+          <w:p>
+            <w:pPr>
+              <w:pStyle w:val="Compact"/>
+            </w:pPr>
+            <w:r>
+              <w:rPr>
+                <w:lang w:val="fr-BF"/>
+              </w:rPr>
+              <w:t xml:space="preserve">p_quantite</w:t>
+            </w:r>
+          </w:p>
+        </w:tc>
+        <w:tc>
+          <w:tcPr>
+            <w:tcW w:w="5900" w:type="dxa"/>
+          </w:tcPr>
+          <w:p>
+            <w:pPr>
+              <w:pStyle w:val="Compact"/>
+            </w:pPr>
+            <w:r>
+              <w:rPr>
+                <w:lang w:val="fr-BF"/>
+              </w:rPr>
+              <w:t xml:space="preserve">Quantité sortie. La valeur 0 est autorisée (aucune décrémentation, mais le mouvement est tout de même tracé).</w:t>
+            </w:r>
+          </w:p>
+        </w:tc>
+      </w:tr>
+      <w:tr>
+        <w:trPr>
+          <w:tblCellSpacing w:w="15" w:type="dxa"/>
+        </w:trPr>
+        <w:tc>
+          <w:tcPr>
+            <w:tcW w:w="3000" w:type="dxa"/>
+          </w:tcPr>
+          <w:p>
+            <w:pPr>
+              <w:pStyle w:val="Compact"/>
+            </w:pPr>
+            <w:r>
+              <w:rPr>
+                <w:lang w:val="fr-BF"/>
+              </w:rPr>
+              <w:t xml:space="preserve">p_session</w:t>
+            </w:r>
+          </w:p>
+        </w:tc>
+        <w:tc>
+          <w:tcPr>
+            <w:tcW w:w="5900" w:type="dxa"/>
+          </w:tcPr>
+          <w:p>
+            <w:pPr>
+              <w:pStyle w:val="Compact"/>
+            </w:pPr>
+            <w:r>
+              <w:rPr>
+                <w:lang w:val="fr-BF"/>
+              </w:rPr>
+              <w:t xml:space="preserve">Session agent à l’origine du mouvement (Matin / Midi / PM / Nuit).</w:t>
+            </w:r>
+          </w:p>
+        </w:tc>
+      </w:tr>
+      <w:tr>
+        <w:trPr>
+          <w:tblCellSpacing w:w="15" w:type="dxa"/>
+        </w:trPr>
+        <w:tc>
+          <w:tcPr>
+            <w:tcW w:w="3000" w:type="dxa"/>
+          </w:tcPr>
+          <w:p>
+            <w:pPr>
+              <w:pStyle w:val="Compact"/>
+            </w:pPr>
+            <w:r>
+              <w:rPr>
+                <w:lang w:val="fr-BF"/>
+              </w:rPr>
+              <w:t xml:space="preserve">p_note</w:t>
+            </w:r>
+          </w:p>
+        </w:tc>
+        <w:tc>
+          <w:tcPr>
+            <w:tcW w:w="5900" w:type="dxa"/>
+          </w:tcPr>
+          <w:p>
+            <w:pPr>
+              <w:pStyle w:val="Compact"/>
+            </w:pPr>
+            <w:r>
+              <w:rPr>
+                <w:lang w:val="fr-BF"/>
+              </w:rPr>
+              <w:t xml:space="preserve">Note libre. Si NULL, générée automatiquement : « {type_produit} utilisé — Session {session} ».</w:t>
+            </w:r>
+          </w:p>
+        </w:tc>
+      </w:tr>
+    </w:tbl>
+    <w:p>
+      <w:pPr>
+        <w:pStyle w:val="Corpsdetexte"/>
+      </w:pPr>
+      <w:r>
+        <w:rPr>
+          <w:b/>
+          <w:bCs/>
+          <w:lang w:val="fr-BF"/>
+        </w:rPr>
+        <w:t xml:space="preserve">Sélection du lot :</w:t>
+      </w:r>
+    </w:p>
+    <w:p>
+      <w:pPr>
+        <w:pStyle w:val="Corpsdetexte"/>
+      </w:pPr>
+      <w:r>
+        <w:rPr>
+          <w:lang w:val="fr-BF"/>
+        </w:rPr>
+        <w:t xml:space="preserve">La RPC lit ferme_id depuis current_setting(‘request.headers’)::json-&gt;&gt;‘x-ferme-id’, puis cherche dans lots_stock le lot correspondant à la ferme ET à la bande, dont le nom de produit contient p_type_produit, avec statut = ‘EN STOCK’ et impute_journal = false (ou NULL). Elle retient le plus récent (ORDER BY created_at DESC LIMIT 1).</w:t>
+      </w:r>
+    </w:p>
+    <w:p>
+      <w:pPr>
+        <w:pStyle w:val="Corpsdetexte"/>
+      </w:pPr>
+      <w:r>
+        <w:rPr>
+          <w:b/>
+          <w:bCs/>
+          <w:lang w:val="fr-BF"/>
+        </w:rPr>
+        <w:t xml:space="preserve">Comportement :</w:t>
+      </w:r>
+    </w:p>
+    <w:p>
+      <w:pPr>
+        <w:pStyle w:val="Corpsdetexte"/>
+      </w:pPr>
+      <w:r>
+        <w:rPr>
+          <w:lang w:val="fr-BF"/>
+        </w:rPr>
+        <w:t xml:space="preserve">1) Si aucun lot ne correspond → retour jsonb {success:false, error:‘Aucun lot actif trouvé pour…’}. 2) Si p_quantite &gt; 0 et stock insuffisant → {success:false, error:‘Stock insuffisant…’}. 3) Sinon : décrémentation de lots_stock.quantite_restante, puis INSERT dans mouvements_stock (type_mouvement = ‘SORTIE’, cout_impute = 0). 4) Retour {success:true, produit, quantite, session}.</w:t>
+      </w:r>
+    </w:p>
+    <w:p>
+      <w:pPr>
+        <w:pStyle w:val="Corpsdetexte"/>
+      </w:pPr>
+      <w:r>
+        <w:rPr>
+          <w:b/>
+          <w:bCs/>
+          <w:lang w:val="fr-BF"/>
+        </w:rPr>
+        <w:t xml:space="preserve">Point clé — aucune écriture au journal. cout_impute vaut 0 et aucune ligne n’est créée dans journal. C’est exactement la définition du Type B ci-dessus : le produit sort du stock sans jamais entrer dans le CRU. À ne pas confondre avec imputer_stock(), qui elle écrit la charge.</w:t>
+      </w:r>
+    </w:p>
+    <w:p>
+      <w:pPr>
+        <w:pStyle w:val="Corpsdetexte"/>
+      </w:pPr>
+      <w:r>
+        <w:rPr>
+          <w:lang w:val="fr-BF"/>
+        </w:rPr>
+        <w:t xml:space="preserve">⚠️ La RPC ne lève pas d’exception en cas d’échec — elle renvoie un jsonb avec success:false. Le code appelant doit donc tester ce champ : un appel « réussi » côté Supabase ne signifie pas que l’imputation a eu lieu.</w:t>
+      </w:r>
+    </w:p>
+    <w:p>
+      <w:pPr>
+        <w:pStyle w:val="Corpsdetexte"/>
+      </w:pPr>
+      <w:r>
+        <w:rPr>
+          <w:lang w:val="fr-BF"/>
+        </w:rPr>
+        <w:t xml:space="preserve">💡 En clair : c’est la sortie de stock « silencieuse ». On retire un produit du magasin et on le note dans le registre des mouvements, mais on n’inscrit aucune dépense dans les comptes — donc ça n’alourdit pas le coût de revient du poulet. Et on lui donne le nom du produit, pas le numéro du sac : elle retrouve le bon sac toute seule, en prenant le plus récent.</w:t>
+      </w:r>
+    </w:p>
+    <w:p>
+      <w:pPr>
+        <w:pStyle w:val="Corpsdetexte"/>
+      </w:pPr>
+      <w:r>
+        <w:rPr>
+          <w:b/>
+          <w:bCs/>
+          <w:lang w:val="fr-BF"/>
+        </w:rPr>
+        <w:t xml:space="preserve">⚠️ Surcharge des RPC d’imputation — relevé en base le 23/07/2026</w:t>
+      </w:r>
+    </w:p>
+    <w:p>
+      <w:pPr>
+        <w:pStyle w:val="Corpsdetexte"/>
+      </w:pPr>
+      <w:r>
+        <w:rPr>
+          <w:lang w:val="fr-BF"/>
+        </w:rPr>
+        <w:t xml:space="preserve">PostgreSQL autorise plusieurs fonctions de même nom si leurs signatures diffèrent. Trois fonctions d’imputation coexistent aujourd’hui. Relevé via pg_get_function_identity_arguments :</w:t>
+      </w:r>
+    </w:p>
+    <w:tbl>
+      <w:tblPr>
+        <w:tblW w:w="0" w:type="auto"/>
+        <w:tblCellSpacing w:w="15" w:type="dxa"/>
+        <w:tblLook w:val="04A0" w:firstRow="1" w:lastRow="0" w:firstColumn="1" w:lastColumn="0" w:noHBand="0" w:noVBand="1"/>
+      </w:tblPr>
+      <w:tblGrid>
+        <w:gridCol w:w="1100"/>
+        <w:gridCol w:w="4400"/>
+        <w:gridCol w:w="3400"/>
+      </w:tblGrid>
+      <w:tr>
+        <w:trPr>
+          <w:tblCellSpacing w:w="15" w:type="dxa"/>
+        </w:trPr>
+        <w:tc>
+          <w:tcPr>
+            <w:tcW w:w="1100" w:type="dxa"/>
+          </w:tcPr>
+          <w:p>
+            <w:pPr>
+              <w:pStyle w:val="Compact"/>
+            </w:pPr>
+            <w:r>
+              <w:rPr>
+                <w:b/>
+                <w:bCs/>
+                <w:lang w:val="fr-BF"/>
+              </w:rPr>
+              <w:t xml:space="preserve">oid</w:t>
+            </w:r>
+          </w:p>
+        </w:tc>
+        <w:tc>
+          <w:tcPr>
+            <w:tcW w:w="4400" w:type="dxa"/>
+          </w:tcPr>
+          <w:p>
+            <w:pPr>
+              <w:pStyle w:val="Compact"/>
+            </w:pPr>
+            <w:r>
+              <w:rPr>
+                <w:b/>
+                <w:bCs/>
+                <w:lang w:val="fr-BF"/>
+              </w:rPr>
+              <w:t xml:space="preserve">Signature</w:t>
+            </w:r>
+          </w:p>
+        </w:tc>
+        <w:tc>
+          <w:tcPr>
+            <w:tcW w:w="3400" w:type="dxa"/>
+          </w:tcPr>
+          <w:p>
+            <w:pPr>
+              <w:pStyle w:val="Compact"/>
+            </w:pPr>
+            <w:r>
+              <w:rPr>
+                <w:b/>
+                <w:bCs/>
+                <w:lang w:val="fr-BF"/>
+              </w:rPr>
+              <w:t xml:space="preserve">Retour</w:t>
+            </w:r>
+          </w:p>
+        </w:tc>
+      </w:tr>
+      <w:tr>
+        <w:trPr>
+          <w:tblCellSpacing w:w="15" w:type="dxa"/>
+        </w:trPr>
+        <w:tc>
+          <w:tcPr>
+            <w:tcW w:w="1100" w:type="dxa"/>
+          </w:tcPr>
+          <w:p>
+            <w:pPr>
+              <w:pStyle w:val="Compact"/>
+            </w:pPr>
+            <w:r>
+              <w:rPr>
+                <w:lang w:val="fr-BF"/>
+              </w:rPr>
+              <w:t xml:space="preserve">18919</w:t>
+            </w:r>
+          </w:p>
+        </w:tc>
+        <w:tc>
+          <w:tcPr>
+            <w:tcW w:w="4400" w:type="dxa"/>
+          </w:tcPr>
+          <w:p>
+            <w:pPr>
+              <w:pStyle w:val="Compact"/>
+            </w:pPr>
+            <w:r>
+              <w:rPr>
+                <w:lang w:val="fr-BF"/>
+              </w:rPr>
+              <w:t xml:space="preserve">imputer_stock(p_bande_id uuid, p_produit_like text, p_quantite numeric, p_session…)</w:t>
+            </w:r>
+          </w:p>
+        </w:tc>
+        <w:tc>
+          <w:tcPr>
+            <w:tcW w:w="3400" w:type="dxa"/>
+          </w:tcPr>
+          <w:p>
+            <w:pPr>
+              <w:pStyle w:val="Compact"/>
+            </w:pPr>
+            <w:r>
+              <w:rPr>
+                <w:lang w:val="fr-BF"/>
+              </w:rPr>
+              <w:t xml:space="preserve">jsonb</w:t>
+            </w:r>
+          </w:p>
+        </w:tc>
+      </w:tr>
+      <w:tr>
+        <w:trPr>
+          <w:tblCellSpacing w:w="15" w:type="dxa"/>
+        </w:trPr>
+        <w:tc>
+          <w:tcPr>
+            <w:tcW w:w="1100" w:type="dxa"/>
+          </w:tcPr>
+          <w:p>
+            <w:pPr>
+              <w:pStyle w:val="Compact"/>
+            </w:pPr>
+            <w:r>
+              <w:rPr>
+                <w:lang w:val="fr-BF"/>
+              </w:rPr>
+              <w:t xml:space="preserve">18918</w:t>
+            </w:r>
+          </w:p>
+        </w:tc>
+        <w:tc>
+          <w:tcPr>
+            <w:tcW w:w="4400" w:type="dxa"/>
+          </w:tcPr>
+          <w:p>
+            <w:pPr>
+              <w:pStyle w:val="Compact"/>
+            </w:pPr>
+            <w:r>
+              <w:rPr>
+                <w:lang w:val="fr-BF"/>
+              </w:rPr>
+              <w:t xml:space="preserve">imputer_stock(p_lot_id uuid, p_bande_id uuid, p_quantite numeric, p_libelle text…)</w:t>
+            </w:r>
+          </w:p>
+        </w:tc>
+        <w:tc>
+          <w:tcPr>
+            <w:tcW w:w="3400" w:type="dxa"/>
+          </w:tcPr>
+          <w:p>
+            <w:pPr>
+              <w:pStyle w:val="Compact"/>
+            </w:pPr>
+            <w:r>
+              <w:rPr>
+                <w:lang w:val="fr-BF"/>
+              </w:rPr>
+              <w:t xml:space="preserve">json</w:t>
+            </w:r>
+          </w:p>
+        </w:tc>
+      </w:tr>
+      <w:tr>
+        <w:trPr>
+          <w:tblCellSpacing w:w="15" w:type="dxa"/>
+        </w:trPr>
+        <w:tc>
+          <w:tcPr>
+            <w:tcW w:w="1100" w:type="dxa"/>
+          </w:tcPr>
+          <w:p>
+            <w:pPr>
+              <w:pStyle w:val="Compact"/>
+            </w:pPr>
+            <w:r>
+              <w:rPr>
+                <w:lang w:val="fr-BF"/>
+              </w:rPr>
+              <w:t xml:space="preserve">18741</w:t>
+            </w:r>
+          </w:p>
+        </w:tc>
+        <w:tc>
+          <w:tcPr>
+            <w:tcW w:w="4400" w:type="dxa"/>
+          </w:tcPr>
+          <w:p>
+            <w:pPr>
+              <w:pStyle w:val="Compact"/>
+            </w:pPr>
+            <w:r>
+              <w:rPr>
+                <w:lang w:val="fr-BF"/>
+              </w:rPr>
+              <w:t xml:space="preserve">imputer_stock_type_b(p_bande_id uuid, p_type_produit text, p_quantite numeric, p_session…)</w:t>
+            </w:r>
+          </w:p>
+        </w:tc>
+        <w:tc>
+          <w:tcPr>
+            <w:tcW w:w="3400" w:type="dxa"/>
+          </w:tcPr>
+          <w:p>
+            <w:pPr>
+              <w:pStyle w:val="Compact"/>
+            </w:pPr>
+            <w:r>
+              <w:rPr>
+                <w:lang w:val="fr-BF"/>
+              </w:rPr>
+              <w:t xml:space="preserve">jsonb</w:t>
+            </w:r>
+          </w:p>
+        </w:tc>
+      </w:tr>
+    </w:tbl>
+    <w:p>
+      <w:pPr>
+        <w:pStyle w:val="Corpsdetexte"/>
+      </w:pPr>
+      <w:r>
+        <w:rPr>
+          <w:lang w:val="fr-BF"/>
+        </w:rPr>
+        <w:t xml:space="preserve">Conséquence : imputer_stock existe en DEUX versions (18918 et 18919), l’une prenant un p_lot_id, l’autre un p_produit_like. Le choix de la version appelée dépend entièrement des paramètres transmis par le JS. Avant toute modification d’un appel à imputer_stock, vérifier laquelle des deux est réellement visée. À nettoyer dans une future migration.</w:t>
+      </w:r>
+    </w:p>
+    <w:p>
+      <w:pPr>
+        <w:pStyle w:val="Corpsdetexte"/>
+      </w:pPr>
+      <w:r>
+        <w:rPr>
+          <w:b/>
+          <w:bCs/>
+          <w:lang w:val="fr-BF"/>
+        </w:rPr>
+        <w:t xml:space="preserve">⚠️ ÉCART ENTRE LE FICHIER DE MIGRATION ET LA BASE — imputer_stock_type_b</w:t>
+      </w:r>
+    </w:p>
+    <w:p>
+      <w:pPr>
+        <w:pStyle w:val="Corpsdetexte"/>
+      </w:pPr>
+      <w:r>
+        <w:rPr>
+          <w:lang w:val="fr-BF"/>
+        </w:rPr>
+        <w:t xml:space="preserve">Le fichier migrations/015 décrit une fonction imputer_stock_type_b(p_lot_id, p_bande_id, p_quantite, p_session, p_note) RETURNS json, qui refuse explicitement les lots Type A et surtout insère le mouvement avec statut = ‘EN_ATTENTE’ (validation gérant requise via valider_imputation_gerant). Cette fonction N’EST PAS en base. La seule imputer_stock_type_b existante est l’oid 18741, de signature différente, qui n’écrit AUCUN statut EN_ATTENTE.</w:t>
+      </w:r>
+    </w:p>
+    <w:p>
+      <w:pPr>
+        <w:pStyle w:val="Corpsdetexte"/>
+      </w:pPr>
+      <w:r>
+        <w:rPr>
+          <w:b/>
+          <w:bCs/>
+          <w:lang w:val="fr-BF"/>
+        </w:rPr>
+        <w:t xml:space="preserve">Point de contrôle à trancher : un mouvement créé par la fonction réellement en base est donc définitif immédiatement, sans passer par la validation du gérant. Soit c’est un choix assumé — et il faut le documenter comme tel — soit c’est une régression du circuit de validation, et il faut rétablir le statut EN_ATTENTE. À arbitrer par Adama avant tout développement touchant aux sorties de stock Type B.</w:t>
+      </w:r>
+    </w:p>
+    <w:p>
+      <w:pPr>
+        <w:pStyle w:val="Corpsdetexte"/>
+      </w:pPr>
+      <w:r>
+        <w:rPr>
+          <w:lang w:val="fr-BF"/>
+        </w:rPr>
+        <w:t xml:space="preserve">💡 En clair : le plan écrit dans le dossier migrations dit que l’agent sort un produit du stock et que ça reste « en attente » jusqu’à ce que le gérant valide. La machine réellement installée ne fait pas cette pause : elle enregistre directement. Ce n’est pas forcément grave, mais c’est un contrôle du gérant qui saute sans que personne l’ait décidé. À trancher.</w:t>
+      </w:r>
+    </w:p>
+    <w:p>
+      <w:pPr>
+        <w:pStyle w:val="Corpsdetexte"/>
+      </w:pPr>
+      <w:r>
+        <w:rPr>
+          <w:lang w:val="fr-BF"/>
+        </w:rPr>
+        <w:t xml:space="preserve">Leçon de méthode : un fichier dans migrations/ prouve qu’une migration a été écrite, jamais qu’elle est l’état actuel de la base. Une migration ultérieure a pu la remplacer. Corollaire de la règle absolue n°1 : la base est la seule vérité.</w:t>
       </w:r>
     </w:p>
     <w:p>
@@ -10111,13 +11754,13 @@
           <w:bCs/>
           <w:lang w:val="fr-FR"/>
         </w:rPr>
-        <w:t xml:space="preserve">Reste à nettoyer (futures migrations 043+) : </w:t>
-      </w:r>
-      <w:r>
-        <w:rPr>
-          <w:lang w:val="fr-FR"/>
-        </w:rPr>
-        <w:t xml:space="preserve">le même doublon acces_par_ferme (anon) + ferme_isolation (public) subsiste sur bandes, journal, mouvements_stock, saisies_techniques, taches. Même recette que la 042, en gardant la policy du rôle anon (celui réellement utilisé par l’app). Sans urgence — aucune faille, uniquement du rangement.</w:t>
+        <w:t xml:space="preserve">Doublons de policies RLS — NETTOYAGE FAIT (migrations 043 + 044, v26.30) : </w:t>
+      </w:r>
+      <w:r>
+        <w:rPr>
+          <w:lang w:val="fr-FR"/>
+        </w:rPr>
+        <w:t xml:space="preserve">le même doublon acces_par_ferme (anon) + ferme_isolation (public) qui subsistait sur bandes, journal, mouvements_stock, saisies_techniques et taches a été traité par les migrations 043 et 044, même recette que la 042 (on garde la policy du rôle anon, celui réellement utilisé par l’app). Il subsiste un doublon de même nature sur la table fermes (observé v26.34) : ferme_isolation (ALL) fait double emploi avec fermes_select (SELECT) et fermes_update (UPDATE), toutes sur id = get_ferme_id(). Sans danger, rangement pur — à traiter dans une future migration.</w:t>
       </w:r>
     </w:p>
     <w:p>
@@ -10159,7 +11802,7 @@
         <w:rPr>
           <w:lang w:val="fr-FR"/>
         </w:rPr>
-        <w:t xml:space="preserve">le dossier migrations/ présente des numéros intermédiaires manquants (017, 020–025, 029, 033–034 — vraisemblablement des migrations fusionnées, renommées ou jamais créées ; le 041 est volontairement vacant, migration abandonnée). La 040 (040_date_livraison_commandes.sql) existe bien et reste la dernière migration réellement appliquée avant la 042. Trou de numérotation sans conséquence, à documenter au besoin.</w:t>
+        <w:t xml:space="preserve">le dossier migrations/ présente des numéros intermédiaires manquants (017, 020–025, 029, 033–034 — vraisemblablement des migrations fusionnées, renommées ou jamais créées ; le 041 est volontairement vacant, migration abandonnée). La 040 (040_date_livraison_commandes.sql) existe bien et était la dernière migration appliquée avant la 042. Depuis, les migrations 042 à 047 ont été appliquées (voir §2.5) — dernière migration à ce jour : 047. Trou de numérotation sans conséquence, à documenter au besoin.</w:t>
       </w:r>
     </w:p>
     <w:p>
@@ -10312,7 +11955,7 @@
         <w:rPr>
           <w:lang w:val="fr-FR"/>
         </w:rPr>
-        <w:t xml:space="preserve"> brutes) : toujours non résolu, priorité moyenne — voir section 5. Le blocage technique précédent (“0 changed files” GitHub Desktop) n’a pas été creusé ; à la reprise, vérifier d’abord la sauvegarde (Ctrl+S) avant de retenter l’édition.</w:t>
+        <w:t xml:space="preserve"> brutes) : ✅ RÉSOLU en v26.30 — voir section 5. Deux balises étaient en cause, pas une seule, ce qui explique l’échec du premier correctif.</w:t>
       </w:r>
     </w:p>
     <w:p>
@@ -10390,7 +12033,7 @@
         <w:rPr>
           <w:lang w:val="fr-FR"/>
         </w:rPr>
-        <w:t xml:space="preserve"> : à redéfinir. Le chantier initialement annoncé comme “priorité haute” (imputation multi-produits stock) est en réalité déjà clos (voir section 6). Restent en attente : bug cosmétique score santé (priorité moyenne, 5 min), session RLS dédiée (section 14.3), verrou session agent non déblocable à distance par le gérant (limitation connue, chantier futur), mode offline et dashboard SaaS (vision long terme).</w:t>
+        <w:t xml:space="preserve"> (mis à jour v26.34) : le bug cosmétique score santé est fermé (v26.30) et la session RLS dédiée est réalisée (§14.4). Restent en attente, par ordre : alerte échéance (§16.6, dernier morceau de l’étape 3 CRM), étapes 4 à 6 du §16.2 (export WhatsApp, écran Trésorerie/Caisse, mouvements hors-bande), authentification JWT (LA faille de fond, prérequis SaaS — voir §14.4), bouton « Forcer la déconnexion » qui ne libère pas le verrou, sw.js STATIC_URLS incomplet, mode offline et dashboard SaaS (vision long terme).</w:t>
       </w:r>
     </w:p>
     <w:p>
@@ -12036,7 +13679,7 @@
               <w:rPr>
                 <w:lang w:val="fr-BF"/>
               </w:rPr>
-              <w:t>○ À faire</w:t>
+              <w:t>✅ Validé (v26.34)</w:t>
             </w:r>
           </w:p>
         </w:tc>
@@ -12945,6 +14588,50 @@
       <w:pPr>
         <w:pStyle w:val="Corpsdetexte"/>
         <w:rPr>
+          <w:lang w:val="fr-BF"/>
+        </w:rPr>
+      </w:pPr>
+      <w:r>
+        <w:rPr>
+          <w:b/>
+          <w:bCs/>
+          <w:lang w:val="fr-BF"/>
+        </w:rPr>
+        <w:t xml:space="preserve">⚠️ À diagnostiquer AVANT de coder (ajout v26.35) : l’alerte s’appuie sur commandes.date_reglement_prevue — à ne pas confondre avec date_livraison_prevue (§18.4). Or il n’est pas établi qu’un écran permette aujourd’hui de SAISIR cette date : la planification impose la date de livraison, pas l’échéance de règlement. Si la colonne reste vide en base, l’alerte n’aura rien à afficher, quelle que soit la qualité du code. Vérifier d’abord en base, puis dans le code.</w:t>
+      </w:r>
+    </w:p>
+    <w:p>
+      <w:pPr>
+        <w:pStyle w:val="Corpsdetexte"/>
+        <w:rPr>
+          <w:lang w:val="fr-BF"/>
+        </w:rPr>
+      </w:pPr>
+      <w:r>
+        <w:rPr>
+          <w:lang w:val="fr-BF"/>
+        </w:rPr>
+        <w:t xml:space="preserve">⚠️ Terrain différent : l’accueil gérant vit dans index.html (~5900 lignes), pas dans les modules ES — voir §17 pour la frontière entre les deux mondes.</w:t>
+      </w:r>
+    </w:p>
+    <w:p>
+      <w:pPr>
+        <w:pStyle w:val="Corpsdetexte"/>
+        <w:rPr>
+          <w:lang w:val="fr-BF"/>
+        </w:rPr>
+      </w:pPr>
+      <w:r>
+        <w:rPr>
+          <w:lang w:val="fr-BF"/>
+        </w:rPr>
+        <w:t xml:space="preserve">💡 En clair : avant de construire la sonnette qui prévient « ce client doit payer demain », il faut vérifier qu’il existe bien un endroit où tu inscris cette date d’échéance. Sinon la sonnette ne sonnera jamais.</w:t>
+      </w:r>
+    </w:p>
+    <w:p>
+      <w:pPr>
+        <w:pStyle w:val="Corpsdetexte"/>
+        <w:rPr>
           <w:b/>
           <w:bCs/>
           <w:lang w:val="fr-BF"/>
@@ -13425,7 +15112,49 @@
         <w:rPr>
           <w:lang w:val="fr-BF"/>
         </w:rPr>
-        <w:t xml:space="preserve">    └── clients/        ← à venir</w:t>
+        <w:t xml:space="preserve">    ├── clients/        ← écran Clients (CRM §16)</w:t>
+      </w:r>
+    </w:p>
+    <w:p>
+      <w:pPr>
+        <w:pStyle w:val="Corpsdetexte"/>
+        <w:rPr>
+          <w:lang w:val="fr-BF"/>
+        </w:rPr>
+      </w:pPr>
+      <w:r>
+        <w:rPr>
+          <w:lang w:val="fr-BF"/>
+        </w:rPr>
+        <w:t xml:space="preserve">    ├── commandes/      ← CRM Commandes + Paiements (§18, §19)</w:t>
+      </w:r>
+    </w:p>
+    <w:p>
+      <w:pPr>
+        <w:pStyle w:val="Corpsdetexte"/>
+        <w:rPr>
+          <w:lang w:val="fr-BF"/>
+        </w:rPr>
+      </w:pPr>
+      <w:r>
+        <w:rPr>
+          <w:lang w:val="fr-BF"/>
+        </w:rPr>
+        <w:t xml:space="preserve">    └── parametres/     ← écran Paramètres (§20)</w:t>
+      </w:r>
+    </w:p>
+    <w:p>
+      <w:pPr>
+        <w:pStyle w:val="Corpsdetexte"/>
+        <w:rPr>
+          <w:lang w:val="fr-BF"/>
+        </w:rPr>
+      </w:pPr>
+      <w:r>
+        <w:rPr>
+          <w:lang w:val="fr-BF"/>
+        </w:rPr>
+        <w:t xml:space="preserve">Arborescence à jour au 23/07/2026 (v26.35). Chaque nouveau module suit la même règle : un dossier dédié, un vrai module ES, une seule porte d’entrée exposée sur window (§17.4).</w:t>
       </w:r>
     </w:p>
     <w:p>
@@ -14439,7 +16168,7 @@
         <w:rPr>
           <w:lang w:val="fr-BF"/>
         </w:rPr>
-        <w:t xml:space="preserve"> (ouvert v26.22) : la liste ne contient que /AVIGEST4/ et /AVIGEST4/index.html. Les nouveaux fichiers (css/gestion.css, js/shared/db.js, js/shared/helpers.js, js/gestion/gestion.js) n'y figurent pas. </w:t>
+        <w:t xml:space="preserve"> (ouvert v26.22) : la liste ne contient que /AVIGEST4/ et /AVIGEST4/index.html. Aucun fichier de module n’y figure : css/gestion.css, js/shared/db.js, js/shared/helpers.js, js/gestion/gestion.js, js/clients/, js/commandes/commandes.js et js/parametres/parametres.js. ⚠️ Point AGGRAVÉ à chaque nouveau module (mis à jour v26.35). </w:t>
       </w:r>
       <w:r>
         <w:rPr>
@@ -14493,7 +16222,7 @@
         <w:rPr>
           <w:lang w:val="fr-BF"/>
         </w:rPr>
-        <w:t xml:space="preserve"> (observé v26.22) : deux clients Supabase coexistent dans la page — création ligne 549 puis réaffectation ligne 526 d'index.html. Sans gravité constatée à ce jour, mais à surveiller.</w:t>
+        <w:t xml:space="preserve"> (observé v26.22) : deux clients Supabase coexistent dans la page — création ligne 549 puis réaffectation ligne 526 d'index.html. Sans gravité constatée à ce jour, mais à surveiller. — À ajouter également : la règle ~$* dans .gitignore, pour ignorer les fichiers temporaires Word (~$ble_avigest_v26.docx remonte à chaque commit).</w:t>
       </w:r>
     </w:p>
     <w:p>
@@ -14519,7 +16248,7 @@
         <w:rPr>
           <w:lang w:val="fr-BF"/>
         </w:rPr>
-        <w:t xml:space="preserve"> (observé v26.22) — RÉSOLU en v26.30 (Migration 042) : la policy redondante ferme_isolation a été supprimée, clients_isolation conservée. Le même doublon subsiste sur bandes, journal, mouvements_stock, saisies_techniques et taches (futures migrations 043+, sans urgence — voir §14.4).</w:t>
+        <w:t xml:space="preserve"> (observé v26.22) — RÉSOLU en v26.30 (Migration 042) : la policy redondante ferme_isolation a été supprimée, clients_isolation conservée. Le même doublon a ensuite été nettoyé sur taches (Migration 043) puis sur bandes, journal, mouvements_stock et saisies_techniques (Migration 044). ⚠️ Il subsiste sur la table fermes : ferme_isolation (ALL) fait double emploi avec fermes_select (SELECT) et fermes_update (UPDATE), toutes sur id = get_ferme_id() (observé v26.34). Sans danger, rangement pur — à traiter dans une future migration.</w:t>
       </w:r>
     </w:p>
     <w:p>
@@ -16084,7 +17813,7 @@
           <w:bCs/>
           <w:lang w:val="fr-BF"/>
         </w:rPr>
-        <w:t xml:space="preserve">Version actuelle : APP_VERSION = 'v26.28' · CACHE_NAME = 'avigest-v26-28'</w:t>
+        <w:t xml:space="preserve">Version actuelle : APP_VERSION = 'v26.34' · CACHE_NAME = 'avigest-v26-34'</w:t>
       </w:r>
       <w:r>
         <w:rPr>
@@ -16104,7 +17833,7 @@
         <w:rPr>
           <w:lang w:val="fr-BF"/>
         </w:rPr>
-        <w:t xml:space="preserve">Migrations ajoutées depuis v26.22 :</w:t>
+        <w:t xml:space="preserve">Migrations ajoutées depuis v26.22 (à jour au 23/07/2026) :</w:t>
       </w:r>
     </w:p>
     <w:tbl>
@@ -16297,6 +18026,373 @@
           </w:p>
         </w:tc>
       </w:tr>
+      <w:tr>
+        <w:trPr>
+          <w:tblCellSpacing w:w="15" w:type="dxa"/>
+        </w:trPr>
+        <w:tc>
+          <w:tcPr>
+            <w:tcW w:w="3400" w:type="dxa"/>
+            <w:tcMar>
+              <w:top w:w="15" w:type="dxa"/>
+              <w:left w:w="15" w:type="dxa"/>
+              <w:bottom w:w="15" w:type="dxa"/>
+              <w:right w:w="15" w:type="dxa"/>
+            </w:tcMar>
+          </w:tcPr>
+          <w:p>
+            <w:pPr>
+              <w:pStyle w:val="Compact"/>
+              <w:rPr>
+                <w:lang w:val="fr-BF"/>
+              </w:rPr>
+            </w:pPr>
+            <w:r>
+              <w:rPr>
+                <w:lang w:val="fr-BF"/>
+              </w:rPr>
+              <w:t xml:space="preserve">041 — VACANT</w:t>
+            </w:r>
+          </w:p>
+        </w:tc>
+        <w:tc>
+          <w:tcPr>
+            <w:tcW w:w="4900" w:type="dxa"/>
+            <w:tcMar>
+              <w:top w:w="15" w:type="dxa"/>
+              <w:left w:w="15" w:type="dxa"/>
+              <w:bottom w:w="15" w:type="dxa"/>
+              <w:right w:w="15" w:type="dxa"/>
+            </w:tcMar>
+          </w:tcPr>
+          <w:p>
+            <w:pPr>
+              <w:pStyle w:val="Compact"/>
+              <w:rPr>
+                <w:lang w:val="fr-BF"/>
+              </w:rPr>
+            </w:pPr>
+            <w:r>
+              <w:rPr>
+                <w:lang w:val="fr-BF"/>
+              </w:rPr>
+              <w:t xml:space="preserve">Migration abandonnée avant exécution (ciblait un nom de policy inexistant). Aucune trace en base — numéro laissé volontairement vide.</w:t>
+            </w:r>
+          </w:p>
+        </w:tc>
+      </w:tr>
+      <w:tr>
+        <w:trPr>
+          <w:tblCellSpacing w:w="15" w:type="dxa"/>
+        </w:trPr>
+        <w:tc>
+          <w:tcPr>
+            <w:tcW w:w="3400" w:type="dxa"/>
+            <w:tcMar>
+              <w:top w:w="15" w:type="dxa"/>
+              <w:left w:w="15" w:type="dxa"/>
+              <w:bottom w:w="15" w:type="dxa"/>
+              <w:right w:w="15" w:type="dxa"/>
+            </w:tcMar>
+          </w:tcPr>
+          <w:p>
+            <w:pPr>
+              <w:pStyle w:val="Compact"/>
+              <w:rPr>
+                <w:lang w:val="fr-BF"/>
+              </w:rPr>
+            </w:pPr>
+            <w:r>
+              <w:rPr>
+                <w:lang w:val="fr-BF"/>
+              </w:rPr>
+              <w:t xml:space="preserve">042_clients_policy_doublon.sql</w:t>
+            </w:r>
+          </w:p>
+        </w:tc>
+        <w:tc>
+          <w:tcPr>
+            <w:tcW w:w="4900" w:type="dxa"/>
+            <w:tcMar>
+              <w:top w:w="15" w:type="dxa"/>
+              <w:left w:w="15" w:type="dxa"/>
+              <w:bottom w:w="15" w:type="dxa"/>
+              <w:right w:w="15" w:type="dxa"/>
+            </w:tcMar>
+          </w:tcPr>
+          <w:p>
+            <w:pPr>
+              <w:pStyle w:val="Compact"/>
+              <w:rPr>
+                <w:lang w:val="fr-BF"/>
+              </w:rPr>
+            </w:pPr>
+            <w:r>
+              <w:rPr>
+                <w:lang w:val="fr-BF"/>
+              </w:rPr>
+              <w:t xml:space="preserve">Nettoyage du doublon de policy RLS sur clients — suppression de ferme_isolation, conservation de clients_isolation (v26.30).</w:t>
+            </w:r>
+          </w:p>
+        </w:tc>
+      </w:tr>
+      <w:tr>
+        <w:trPr>
+          <w:tblCellSpacing w:w="15" w:type="dxa"/>
+        </w:trPr>
+        <w:tc>
+          <w:tcPr>
+            <w:tcW w:w="3400" w:type="dxa"/>
+            <w:tcMar>
+              <w:top w:w="15" w:type="dxa"/>
+              <w:left w:w="15" w:type="dxa"/>
+              <w:bottom w:w="15" w:type="dxa"/>
+              <w:right w:w="15" w:type="dxa"/>
+            </w:tcMar>
+          </w:tcPr>
+          <w:p>
+            <w:pPr>
+              <w:pStyle w:val="Compact"/>
+            </w:pPr>
+            <w:r>
+              <w:rPr>
+                <w:lang w:val="fr-BF"/>
+              </w:rPr>
+              <w:t xml:space="preserve">043_menage_policy_taches.sql</w:t>
+            </w:r>
+          </w:p>
+        </w:tc>
+        <w:tc>
+          <w:tcPr>
+            <w:tcW w:w="4900" w:type="dxa"/>
+            <w:tcMar>
+              <w:top w:w="15" w:type="dxa"/>
+              <w:left w:w="15" w:type="dxa"/>
+              <w:bottom w:w="15" w:type="dxa"/>
+              <w:right w:w="15" w:type="dxa"/>
+            </w:tcMar>
+          </w:tcPr>
+          <w:p>
+            <w:pPr>
+              <w:pStyle w:val="Compact"/>
+            </w:pPr>
+            <w:r>
+              <w:rPr>
+                <w:lang w:val="fr-BF"/>
+              </w:rPr>
+              <w:t xml:space="preserve">DROP POLICY ferme_isolation ON taches — doublon avec acces_par_ferme (rôle anon), cette dernière conservée (v26.30).</w:t>
+            </w:r>
+          </w:p>
+        </w:tc>
+      </w:tr>
+      <w:tr>
+        <w:trPr>
+          <w:tblCellSpacing w:w="15" w:type="dxa"/>
+        </w:trPr>
+        <w:tc>
+          <w:tcPr>
+            <w:tcW w:w="3400" w:type="dxa"/>
+            <w:tcMar>
+              <w:top w:w="15" w:type="dxa"/>
+              <w:left w:w="15" w:type="dxa"/>
+              <w:bottom w:w="15" w:type="dxa"/>
+              <w:right w:w="15" w:type="dxa"/>
+            </w:tcMar>
+          </w:tcPr>
+          <w:p>
+            <w:pPr>
+              <w:pStyle w:val="Compact"/>
+            </w:pPr>
+            <w:r>
+              <w:rPr>
+                <w:lang w:val="fr-BF"/>
+              </w:rPr>
+              <w:t xml:space="preserve">044_menage_policies_suite.sql</w:t>
+            </w:r>
+          </w:p>
+        </w:tc>
+        <w:tc>
+          <w:tcPr>
+            <w:tcW w:w="4900" w:type="dxa"/>
+            <w:tcMar>
+              <w:top w:w="15" w:type="dxa"/>
+              <w:left w:w="15" w:type="dxa"/>
+              <w:bottom w:w="15" w:type="dxa"/>
+              <w:right w:w="15" w:type="dxa"/>
+            </w:tcMar>
+          </w:tcPr>
+          <w:p>
+            <w:pPr>
+              <w:pStyle w:val="Compact"/>
+            </w:pPr>
+            <w:r>
+              <w:rPr>
+                <w:lang w:val="fr-BF"/>
+              </w:rPr>
+              <w:t xml:space="preserve">Même ménage sur journal, mouvements_stock, saisies_techniques et bandes. ⚠️ La policy partenaire_ses_bandes sur bandes est une policy MÉTIER (accès partenaire à ses seules bandes) — volontairement NON supprimée. Ne jamais la confondre avec un doublon.</w:t>
+            </w:r>
+          </w:p>
+        </w:tc>
+      </w:tr>
+      <w:tr>
+        <w:trPr>
+          <w:tblCellSpacing w:w="15" w:type="dxa"/>
+        </w:trPr>
+        <w:tc>
+          <w:tcPr>
+            <w:tcW w:w="3400" w:type="dxa"/>
+            <w:tcMar>
+              <w:top w:w="15" w:type="dxa"/>
+              <w:left w:w="15" w:type="dxa"/>
+              <w:bottom w:w="15" w:type="dxa"/>
+              <w:right w:w="15" w:type="dxa"/>
+            </w:tcMar>
+          </w:tcPr>
+          <w:p>
+            <w:pPr>
+              <w:pStyle w:val="Compact"/>
+            </w:pPr>
+            <w:r>
+              <w:rPr>
+                <w:lang w:val="fr-BF"/>
+              </w:rPr>
+              <w:t xml:space="preserve">045</w:t>
+            </w:r>
+          </w:p>
+        </w:tc>
+        <w:tc>
+          <w:tcPr>
+            <w:tcW w:w="4900" w:type="dxa"/>
+            <w:tcMar>
+              <w:top w:w="15" w:type="dxa"/>
+              <w:left w:w="15" w:type="dxa"/>
+              <w:bottom w:w="15" w:type="dxa"/>
+              <w:right w:w="15" w:type="dxa"/>
+            </w:tcMar>
+          </w:tcPr>
+          <w:p>
+            <w:pPr>
+              <w:pStyle w:val="Compact"/>
+            </w:pPr>
+            <w:r>
+              <w:rPr>
+                <w:lang w:val="fr-BF"/>
+              </w:rPr>
+              <w:t xml:space="preserve">⚠️ Numéro non documenté — fichier à retrouver dans migrations/ et à décrire ici.</w:t>
+            </w:r>
+          </w:p>
+        </w:tc>
+      </w:tr>
+      <w:tr>
+        <w:trPr>
+          <w:tblCellSpacing w:w="15" w:type="dxa"/>
+        </w:trPr>
+        <w:tc>
+          <w:tcPr>
+            <w:tcW w:w="3400" w:type="dxa"/>
+            <w:tcMar>
+              <w:top w:w="15" w:type="dxa"/>
+              <w:left w:w="15" w:type="dxa"/>
+              <w:bottom w:w="15" w:type="dxa"/>
+              <w:right w:w="15" w:type="dxa"/>
+            </w:tcMar>
+          </w:tcPr>
+          <w:p>
+            <w:pPr>
+              <w:pStyle w:val="Compact"/>
+              <w:rPr>
+                <w:lang w:val="fr-BF"/>
+              </w:rPr>
+            </w:pPr>
+            <w:r>
+              <w:rPr>
+                <w:lang w:val="fr-BF"/>
+              </w:rPr>
+              <w:t xml:space="preserve">046_paiements_numerotation.sql</w:t>
+            </w:r>
+          </w:p>
+        </w:tc>
+        <w:tc>
+          <w:tcPr>
+            <w:tcW w:w="4900" w:type="dxa"/>
+            <w:tcMar>
+              <w:top w:w="15" w:type="dxa"/>
+              <w:left w:w="15" w:type="dxa"/>
+              <w:bottom w:w="15" w:type="dxa"/>
+              <w:right w:w="15" w:type="dxa"/>
+            </w:tcMar>
+          </w:tcPr>
+          <w:p>
+            <w:pPr>
+              <w:pStyle w:val="Compact"/>
+              <w:rPr>
+                <w:lang w:val="fr-BF"/>
+              </w:rPr>
+            </w:pPr>
+            <w:r>
+              <w:rPr>
+                <w:lang w:val="fr-BF"/>
+              </w:rPr>
+              <w:t xml:space="preserve">Sur paiements : annee (int NOT NULL, default année courante), numero_seq (int NOT NULL, sans default — calculé côté JS), annule (bool NOT NULL default false), contrainte UNIQUE (ferme_id, annee, numero_seq) « carnet à souches », CHECK (montant &gt; 0), index sur commande_id.</w:t>
+            </w:r>
+          </w:p>
+        </w:tc>
+      </w:tr>
+      <w:tr>
+        <w:trPr>
+          <w:tblCellSpacing w:w="15" w:type="dxa"/>
+        </w:trPr>
+        <w:tc>
+          <w:tcPr>
+            <w:tcW w:w="3400" w:type="dxa"/>
+            <w:tcMar>
+              <w:top w:w="15" w:type="dxa"/>
+              <w:left w:w="15" w:type="dxa"/>
+              <w:bottom w:w="15" w:type="dxa"/>
+              <w:right w:w="15" w:type="dxa"/>
+            </w:tcMar>
+          </w:tcPr>
+          <w:p>
+            <w:pPr>
+              <w:pStyle w:val="Compact"/>
+              <w:rPr>
+                <w:lang w:val="fr-BF"/>
+              </w:rPr>
+            </w:pPr>
+            <w:r>
+              <w:rPr>
+                <w:lang w:val="fr-BF"/>
+              </w:rPr>
+              <w:t xml:space="preserve">047_fermes_nom_commercial.sql</w:t>
+            </w:r>
+          </w:p>
+        </w:tc>
+        <w:tc>
+          <w:tcPr>
+            <w:tcW w:w="4900" w:type="dxa"/>
+            <w:tcMar>
+              <w:top w:w="15" w:type="dxa"/>
+              <w:left w:w="15" w:type="dxa"/>
+              <w:bottom w:w="15" w:type="dxa"/>
+              <w:right w:w="15" w:type="dxa"/>
+            </w:tcMar>
+          </w:tcPr>
+          <w:p>
+            <w:pPr>
+              <w:pStyle w:val="Compact"/>
+              <w:rPr>
+                <w:lang w:val="fr-BF"/>
+              </w:rPr>
+            </w:pPr>
+            <w:r>
+              <w:rPr>
+                <w:lang w:val="fr-BF"/>
+              </w:rPr>
+              <w:t xml:space="preserve">Sur fermes : ajout de nom_commercial (text, nullable). Les colonnes nom, proprietaire, telephone, ville, pays, email existaient déjà. Policy fermes_update déjà présente — aucun ajout RLS.</w:t>
+            </w:r>
+          </w:p>
+        </w:tc>
+      </w:tr>
     </w:tbl>
     <w:p>
       <w:pPr>
@@ -16317,7 +18413,7 @@
           <w:bCs/>
           <w:lang w:val="fr-BF"/>
         </w:rPr>
-        <w:t xml:space="preserve">040</w:t>
+        <w:t xml:space="preserve">047</w:t>
       </w:r>
       <w:r>
         <w:rPr>
@@ -16336,6 +18432,2228 @@
     </w:p>
     <w:p>
       <w:pPr>
+        <w:pStyle w:val="Titre2"/>
+      </w:pPr>
+      <w:r>
+        <w:rPr>
+          <w:b/>
+          <w:bCs/>
+          <w:lang w:val="fr-BF"/>
+        </w:rPr>
+        <w:t xml:space="preserve">19. Module Paiements / Créances (CHANTIER CLOS — v26.34)</w:t>
+      </w:r>
+    </w:p>
+    <w:p>
+      <w:pPr>
+        <w:pStyle w:val="Titre3"/>
+      </w:pPr>
+      <w:r>
+        <w:rPr>
+          <w:b/>
+          <w:bCs/>
+          <w:lang w:val="fr-BF"/>
+        </w:rPr>
+        <w:t xml:space="preserve">19.1 Objectif et périmètre</w:t>
+      </w:r>
+    </w:p>
+    <w:p>
+      <w:pPr>
+        <w:pStyle w:val="Corpsdetexte"/>
+      </w:pPr>
+      <w:r>
+        <w:rPr>
+          <w:lang w:val="fr-BF"/>
+        </w:rPr>
+        <w:t xml:space="preserve">Ce module met en œuvre l’étape 3 du découpage CRM (§16.2) : le suivi des encaissements et des créances. Il permet au gérant d’enregistrer les règlements reçus sur une commande, de connaître à tout moment le reste à payer, de produire un reçu numéroté pour le client, et d’annuler un paiement saisi par erreur sans jamais l’effacer.</w:t>
+      </w:r>
+    </w:p>
+    <w:p>
+      <w:pPr>
+        <w:pStyle w:val="Corpsdetexte"/>
+      </w:pPr>
+      <w:r>
+        <w:rPr>
+          <w:lang w:val="fr-BF"/>
+        </w:rPr>
+        <w:t xml:space="preserve">Il applique la séparation comptable OHADA posée en §16.1 : une commande livrée crée une CRÉANCE (le client me doit) ; un paiement enregistré alimente la CAISSE (ce que j’ai réellement encaissé). Les deux ne se confondent jamais.</w:t>
+      </w:r>
+    </w:p>
+    <w:p>
+      <w:pPr>
+        <w:pStyle w:val="Corpsdetexte"/>
+      </w:pPr>
+      <w:r>
+        <w:rPr>
+          <w:b/>
+          <w:bCs/>
+          <w:lang w:val="fr-BF"/>
+        </w:rPr>
+        <w:t xml:space="preserve">Seul le GÉRANT saisit. Réservé à l’onglet GESTION, module js/commandes/commandes.js (bloc Règlement du détail commande).</w:t>
+      </w:r>
+    </w:p>
+    <w:p>
+      <w:pPr>
+        <w:pStyle w:val="Corpsdetexte"/>
+      </w:pPr>
+      <w:r>
+        <w:rPr>
+          <w:lang w:val="fr-BF"/>
+        </w:rPr>
+        <w:t xml:space="preserve">💡 En clair : une commande livrée, ce n’est pas de l’argent en poche — c’est une promesse de paiement. Ce module suit qui a payé quoi, combien il reste à encaisser, et donne au client un reçu numéroté comme un carnet à souches.</w:t>
+      </w:r>
+    </w:p>
+    <w:p>
+      <w:pPr>
+        <w:pStyle w:val="Titre3"/>
+      </w:pPr>
+      <w:r>
+        <w:rPr>
+          <w:b/>
+          <w:bCs/>
+          <w:lang w:val="fr-BF"/>
+        </w:rPr>
+        <w:t xml:space="preserve">19.2 Les 6 morceaux (tous validés)</w:t>
+      </w:r>
+    </w:p>
+    <w:tbl>
+      <w:tblPr>
+        <w:tblW w:w="0" w:type="auto"/>
+        <w:tblCellSpacing w:w="15" w:type="dxa"/>
+        <w:tblLook w:val="04A0" w:firstRow="1" w:lastRow="0" w:firstColumn="1" w:lastColumn="0" w:noHBand="0" w:noVBand="1"/>
+      </w:tblPr>
+      <w:tblGrid>
+        <w:gridCol w:w="1000"/>
+        <w:gridCol w:w="5400"/>
+        <w:gridCol w:w="2000"/>
+      </w:tblGrid>
+      <w:tr>
+        <w:trPr>
+          <w:tblCellSpacing w:w="15" w:type="dxa"/>
+        </w:trPr>
+        <w:tc>
+          <w:tcPr>
+            <w:tcW w:w="1000" w:type="dxa"/>
+          </w:tcPr>
+          <w:p>
+            <w:pPr>
+              <w:pStyle w:val="Compact"/>
+            </w:pPr>
+            <w:r>
+              <w:rPr>
+                <w:b/>
+                <w:bCs/>
+                <w:lang w:val="fr-BF"/>
+              </w:rPr>
+              <w:t xml:space="preserve">Morceau</w:t>
+            </w:r>
+          </w:p>
+        </w:tc>
+        <w:tc>
+          <w:tcPr>
+            <w:tcW w:w="5400" w:type="dxa"/>
+          </w:tcPr>
+          <w:p>
+            <w:pPr>
+              <w:pStyle w:val="Compact"/>
+            </w:pPr>
+            <w:r>
+              <w:rPr>
+                <w:b/>
+                <w:bCs/>
+                <w:lang w:val="fr-BF"/>
+              </w:rPr>
+              <w:t xml:space="preserve">Contenu</w:t>
+            </w:r>
+          </w:p>
+        </w:tc>
+        <w:tc>
+          <w:tcPr>
+            <w:tcW w:w="2000" w:type="dxa"/>
+          </w:tcPr>
+          <w:p>
+            <w:pPr>
+              <w:pStyle w:val="Compact"/>
+            </w:pPr>
+            <w:r>
+              <w:rPr>
+                <w:b/>
+                <w:bCs/>
+                <w:lang w:val="fr-BF"/>
+              </w:rPr>
+              <w:t xml:space="preserve">Version</w:t>
+            </w:r>
+          </w:p>
+        </w:tc>
+      </w:tr>
+      <w:tr>
+        <w:trPr>
+          <w:tblCellSpacing w:w="15" w:type="dxa"/>
+        </w:trPr>
+        <w:tc>
+          <w:tcPr>
+            <w:tcW w:w="1000" w:type="dxa"/>
+          </w:tcPr>
+          <w:p>
+            <w:pPr>
+              <w:pStyle w:val="Compact"/>
+            </w:pPr>
+            <w:r>
+              <w:rPr>
+                <w:lang w:val="fr-BF"/>
+              </w:rPr>
+              <w:t xml:space="preserve">1</w:t>
+            </w:r>
+          </w:p>
+        </w:tc>
+        <w:tc>
+          <w:tcPr>
+            <w:tcW w:w="5400" w:type="dxa"/>
+          </w:tcPr>
+          <w:p>
+            <w:pPr>
+              <w:pStyle w:val="Compact"/>
+            </w:pPr>
+            <w:r>
+              <w:rPr>
+                <w:lang w:val="fr-BF"/>
+              </w:rPr>
+              <w:t xml:space="preserve">Migration 046 — numérotation et annulation des paiements</w:t>
+            </w:r>
+          </w:p>
+        </w:tc>
+        <w:tc>
+          <w:tcPr>
+            <w:tcW w:w="2000" w:type="dxa"/>
+          </w:tcPr>
+          <w:p>
+            <w:pPr>
+              <w:pStyle w:val="Compact"/>
+            </w:pPr>
+            <w:r>
+              <w:rPr>
+                <w:lang w:val="fr-BF"/>
+              </w:rPr>
+              <w:t xml:space="preserve">✅ v26.30</w:t>
+            </w:r>
+          </w:p>
+        </w:tc>
+      </w:tr>
+      <w:tr>
+        <w:trPr>
+          <w:tblCellSpacing w:w="15" w:type="dxa"/>
+        </w:trPr>
+        <w:tc>
+          <w:tcPr>
+            <w:tcW w:w="1000" w:type="dxa"/>
+          </w:tcPr>
+          <w:p>
+            <w:pPr>
+              <w:pStyle w:val="Compact"/>
+            </w:pPr>
+            <w:r>
+              <w:rPr>
+                <w:lang w:val="fr-BF"/>
+              </w:rPr>
+              <w:t xml:space="preserve">2</w:t>
+            </w:r>
+          </w:p>
+        </w:tc>
+        <w:tc>
+          <w:tcPr>
+            <w:tcW w:w="5400" w:type="dxa"/>
+          </w:tcPr>
+          <w:p>
+            <w:pPr>
+              <w:pStyle w:val="Compact"/>
+            </w:pPr>
+            <w:r>
+              <w:rPr>
+                <w:lang w:val="fr-BF"/>
+              </w:rPr>
+              <w:t xml:space="preserve">Bloc Règlement dans l’écran détail commande</w:t>
+            </w:r>
+          </w:p>
+        </w:tc>
+        <w:tc>
+          <w:tcPr>
+            <w:tcW w:w="2000" w:type="dxa"/>
+          </w:tcPr>
+          <w:p>
+            <w:pPr>
+              <w:pStyle w:val="Compact"/>
+            </w:pPr>
+            <w:r>
+              <w:rPr>
+                <w:lang w:val="fr-BF"/>
+              </w:rPr>
+              <w:t xml:space="preserve">✅ v26.31</w:t>
+            </w:r>
+          </w:p>
+        </w:tc>
+      </w:tr>
+      <w:tr>
+        <w:trPr>
+          <w:tblCellSpacing w:w="15" w:type="dxa"/>
+        </w:trPr>
+        <w:tc>
+          <w:tcPr>
+            <w:tcW w:w="1000" w:type="dxa"/>
+          </w:tcPr>
+          <w:p>
+            <w:pPr>
+              <w:pStyle w:val="Compact"/>
+            </w:pPr>
+            <w:r>
+              <w:rPr>
+                <w:lang w:val="fr-BF"/>
+              </w:rPr>
+              <w:t xml:space="preserve">3</w:t>
+            </w:r>
+          </w:p>
+        </w:tc>
+        <w:tc>
+          <w:tcPr>
+            <w:tcW w:w="5400" w:type="dxa"/>
+          </w:tcPr>
+          <w:p>
+            <w:pPr>
+              <w:pStyle w:val="Compact"/>
+            </w:pPr>
+            <w:r>
+              <w:rPr>
+                <w:lang w:val="fr-BF"/>
+              </w:rPr>
+              <w:t xml:space="preserve">Saisie du montant + écran de confirmation + enregistrement</w:t>
+            </w:r>
+          </w:p>
+        </w:tc>
+        <w:tc>
+          <w:tcPr>
+            <w:tcW w:w="2000" w:type="dxa"/>
+          </w:tcPr>
+          <w:p>
+            <w:pPr>
+              <w:pStyle w:val="Compact"/>
+            </w:pPr>
+            <w:r>
+              <w:rPr>
+                <w:lang w:val="fr-BF"/>
+              </w:rPr>
+              <w:t xml:space="preserve">✅ v26.32</w:t>
+            </w:r>
+          </w:p>
+        </w:tc>
+      </w:tr>
+      <w:tr>
+        <w:trPr>
+          <w:tblCellSpacing w:w="15" w:type="dxa"/>
+        </w:trPr>
+        <w:tc>
+          <w:tcPr>
+            <w:tcW w:w="1000" w:type="dxa"/>
+          </w:tcPr>
+          <w:p>
+            <w:pPr>
+              <w:pStyle w:val="Compact"/>
+            </w:pPr>
+            <w:r>
+              <w:rPr>
+                <w:lang w:val="fr-BF"/>
+              </w:rPr>
+              <w:t xml:space="preserve">4</w:t>
+            </w:r>
+          </w:p>
+        </w:tc>
+        <w:tc>
+          <w:tcPr>
+            <w:tcW w:w="5400" w:type="dxa"/>
+          </w:tcPr>
+          <w:p>
+            <w:pPr>
+              <w:pStyle w:val="Compact"/>
+            </w:pPr>
+            <w:r>
+              <w:rPr>
+                <w:lang w:val="fr-BF"/>
+              </w:rPr>
+              <w:t xml:space="preserve">Reçu à copier (texte formaté vers le presse-papier)</w:t>
+            </w:r>
+          </w:p>
+        </w:tc>
+        <w:tc>
+          <w:tcPr>
+            <w:tcW w:w="2000" w:type="dxa"/>
+          </w:tcPr>
+          <w:p>
+            <w:pPr>
+              <w:pStyle w:val="Compact"/>
+            </w:pPr>
+            <w:r>
+              <w:rPr>
+                <w:lang w:val="fr-BF"/>
+              </w:rPr>
+              <w:t xml:space="preserve">✅ v26.33</w:t>
+            </w:r>
+          </w:p>
+        </w:tc>
+      </w:tr>
+      <w:tr>
+        <w:trPr>
+          <w:tblCellSpacing w:w="15" w:type="dxa"/>
+        </w:trPr>
+        <w:tc>
+          <w:tcPr>
+            <w:tcW w:w="1000" w:type="dxa"/>
+          </w:tcPr>
+          <w:p>
+            <w:pPr>
+              <w:pStyle w:val="Compact"/>
+            </w:pPr>
+            <w:r>
+              <w:rPr>
+                <w:lang w:val="fr-BF"/>
+              </w:rPr>
+              <w:t xml:space="preserve">5</w:t>
+            </w:r>
+          </w:p>
+        </w:tc>
+        <w:tc>
+          <w:tcPr>
+            <w:tcW w:w="5400" w:type="dxa"/>
+          </w:tcPr>
+          <w:p>
+            <w:pPr>
+              <w:pStyle w:val="Compact"/>
+            </w:pPr>
+            <w:r>
+              <w:rPr>
+                <w:lang w:val="fr-BF"/>
+              </w:rPr>
+              <w:t xml:space="preserve">Annulation d’un paiement avec motif obligatoire</w:t>
+            </w:r>
+          </w:p>
+        </w:tc>
+        <w:tc>
+          <w:tcPr>
+            <w:tcW w:w="2000" w:type="dxa"/>
+          </w:tcPr>
+          <w:p>
+            <w:pPr>
+              <w:pStyle w:val="Compact"/>
+            </w:pPr>
+            <w:r>
+              <w:rPr>
+                <w:lang w:val="fr-BF"/>
+              </w:rPr>
+              <w:t xml:space="preserve">✅ v26.34</w:t>
+            </w:r>
+          </w:p>
+        </w:tc>
+      </w:tr>
+      <w:tr>
+        <w:trPr>
+          <w:tblCellSpacing w:w="15" w:type="dxa"/>
+        </w:trPr>
+        <w:tc>
+          <w:tcPr>
+            <w:tcW w:w="1000" w:type="dxa"/>
+          </w:tcPr>
+          <w:p>
+            <w:pPr>
+              <w:pStyle w:val="Compact"/>
+            </w:pPr>
+            <w:r>
+              <w:rPr>
+                <w:lang w:val="fr-BF"/>
+              </w:rPr>
+              <w:t xml:space="preserve">6</w:t>
+            </w:r>
+          </w:p>
+        </w:tc>
+        <w:tc>
+          <w:tcPr>
+            <w:tcW w:w="5400" w:type="dxa"/>
+          </w:tcPr>
+          <w:p>
+            <w:pPr>
+              <w:pStyle w:val="Compact"/>
+            </w:pPr>
+            <w:r>
+              <w:rPr>
+                <w:lang w:val="fr-BF"/>
+              </w:rPr>
+              <w:t xml:space="preserve">Migration 047 + écran Paramètres + branchement de l’identité ferme sur le reçu</w:t>
+            </w:r>
+          </w:p>
+        </w:tc>
+        <w:tc>
+          <w:tcPr>
+            <w:tcW w:w="2000" w:type="dxa"/>
+          </w:tcPr>
+          <w:p>
+            <w:pPr>
+              <w:pStyle w:val="Compact"/>
+            </w:pPr>
+            <w:r>
+              <w:rPr>
+                <w:lang w:val="fr-BF"/>
+              </w:rPr>
+              <w:t xml:space="preserve">✅ v26.34</w:t>
+            </w:r>
+          </w:p>
+        </w:tc>
+      </w:tr>
+    </w:tbl>
+    <w:p>
+      <w:pPr>
+        <w:pStyle w:val="Titre3"/>
+      </w:pPr>
+      <w:r>
+        <w:rPr>
+          <w:b/>
+          <w:bCs/>
+          <w:lang w:val="fr-BF"/>
+        </w:rPr>
+        <w:t xml:space="preserve">19.3 Migration 046 — numérotation et annulation</w:t>
+      </w:r>
+    </w:p>
+    <w:p>
+      <w:pPr>
+        <w:pStyle w:val="Corpsdetexte"/>
+      </w:pPr>
+      <w:r>
+        <w:rPr>
+          <w:lang w:val="fr-BF"/>
+        </w:rPr>
+        <w:t xml:space="preserve">Fichier : 046_paiements_numerotation.sql. Modifications sur la table paiements (créée par la Migration 036, voir §16.4) :</w:t>
+      </w:r>
+    </w:p>
+    <w:tbl>
+      <w:tblPr>
+        <w:tblW w:w="0" w:type="auto"/>
+        <w:tblCellSpacing w:w="15" w:type="dxa"/>
+        <w:tblLook w:val="04A0" w:firstRow="1" w:lastRow="0" w:firstColumn="1" w:lastColumn="0" w:noHBand="0" w:noVBand="1"/>
+      </w:tblPr>
+      <w:tblGrid>
+        <w:gridCol w:w="2200"/>
+        <w:gridCol w:w="6200"/>
+      </w:tblGrid>
+      <w:tr>
+        <w:trPr>
+          <w:tblCellSpacing w:w="15" w:type="dxa"/>
+        </w:trPr>
+        <w:tc>
+          <w:tcPr>
+            <w:tcW w:w="2200" w:type="dxa"/>
+          </w:tcPr>
+          <w:p>
+            <w:pPr>
+              <w:pStyle w:val="Compact"/>
+            </w:pPr>
+            <w:r>
+              <w:rPr>
+                <w:b/>
+                <w:bCs/>
+                <w:lang w:val="fr-BF"/>
+              </w:rPr>
+              <w:t xml:space="preserve">Élément</w:t>
+            </w:r>
+          </w:p>
+        </w:tc>
+        <w:tc>
+          <w:tcPr>
+            <w:tcW w:w="6200" w:type="dxa"/>
+          </w:tcPr>
+          <w:p>
+            <w:pPr>
+              <w:pStyle w:val="Compact"/>
+            </w:pPr>
+            <w:r>
+              <w:rPr>
+                <w:b/>
+                <w:bCs/>
+                <w:lang w:val="fr-BF"/>
+              </w:rPr>
+              <w:t xml:space="preserve">Rôle</w:t>
+            </w:r>
+          </w:p>
+        </w:tc>
+      </w:tr>
+      <w:tr>
+        <w:trPr>
+          <w:tblCellSpacing w:w="15" w:type="dxa"/>
+        </w:trPr>
+        <w:tc>
+          <w:tcPr>
+            <w:tcW w:w="2200" w:type="dxa"/>
+          </w:tcPr>
+          <w:p>
+            <w:pPr>
+              <w:pStyle w:val="Compact"/>
+            </w:pPr>
+            <w:r>
+              <w:rPr>
+                <w:lang w:val="fr-BF"/>
+              </w:rPr>
+              <w:t xml:space="preserve">annee (int NOT NULL)</w:t>
+            </w:r>
+          </w:p>
+        </w:tc>
+        <w:tc>
+          <w:tcPr>
+            <w:tcW w:w="6200" w:type="dxa"/>
+          </w:tcPr>
+          <w:p>
+            <w:pPr>
+              <w:pStyle w:val="Compact"/>
+            </w:pPr>
+            <w:r>
+              <w:rPr>
+                <w:lang w:val="fr-BF"/>
+              </w:rPr>
+              <w:t xml:space="preserve">Année du reçu. Default : année courante.</w:t>
+            </w:r>
+          </w:p>
+        </w:tc>
+      </w:tr>
+      <w:tr>
+        <w:trPr>
+          <w:tblCellSpacing w:w="15" w:type="dxa"/>
+        </w:trPr>
+        <w:tc>
+          <w:tcPr>
+            <w:tcW w:w="2200" w:type="dxa"/>
+          </w:tcPr>
+          <w:p>
+            <w:pPr>
+              <w:pStyle w:val="Compact"/>
+            </w:pPr>
+            <w:r>
+              <w:rPr>
+                <w:lang w:val="fr-BF"/>
+              </w:rPr>
+              <w:t xml:space="preserve">numero_seq (int NOT NULL)</w:t>
+            </w:r>
+          </w:p>
+        </w:tc>
+        <w:tc>
+          <w:tcPr>
+            <w:tcW w:w="6200" w:type="dxa"/>
+          </w:tcPr>
+          <w:p>
+            <w:pPr>
+              <w:pStyle w:val="Compact"/>
+            </w:pPr>
+            <w:r>
+              <w:rPr>
+                <w:lang w:val="fr-BF"/>
+              </w:rPr>
+              <w:t xml:space="preserve">Numéro d’ordre dans l’année. ⚠️ SANS default — calculé côté JS (voir §19.5).</w:t>
+            </w:r>
+          </w:p>
+        </w:tc>
+      </w:tr>
+      <w:tr>
+        <w:trPr>
+          <w:tblCellSpacing w:w="15" w:type="dxa"/>
+        </w:trPr>
+        <w:tc>
+          <w:tcPr>
+            <w:tcW w:w="2200" w:type="dxa"/>
+          </w:tcPr>
+          <w:p>
+            <w:pPr>
+              <w:pStyle w:val="Compact"/>
+            </w:pPr>
+            <w:r>
+              <w:rPr>
+                <w:lang w:val="fr-BF"/>
+              </w:rPr>
+              <w:t xml:space="preserve">annule (bool NOT NULL)</w:t>
+            </w:r>
+          </w:p>
+        </w:tc>
+        <w:tc>
+          <w:tcPr>
+            <w:tcW w:w="6200" w:type="dxa"/>
+          </w:tcPr>
+          <w:p>
+            <w:pPr>
+              <w:pStyle w:val="Compact"/>
+            </w:pPr>
+            <w:r>
+              <w:rPr>
+                <w:lang w:val="fr-BF"/>
+              </w:rPr>
+              <w:t xml:space="preserve">Default false. Un paiement annulé n’est jamais supprimé, il est marqué.</w:t>
+            </w:r>
+          </w:p>
+        </w:tc>
+      </w:tr>
+      <w:tr>
+        <w:trPr>
+          <w:tblCellSpacing w:w="15" w:type="dxa"/>
+        </w:trPr>
+        <w:tc>
+          <w:tcPr>
+            <w:tcW w:w="2200" w:type="dxa"/>
+          </w:tcPr>
+          <w:p>
+            <w:pPr>
+              <w:pStyle w:val="Compact"/>
+            </w:pPr>
+            <w:r>
+              <w:rPr>
+                <w:lang w:val="fr-BF"/>
+              </w:rPr>
+              <w:t xml:space="preserve">UNIQUE (ferme_id, annee, numero_seq)</w:t>
+            </w:r>
+          </w:p>
+        </w:tc>
+        <w:tc>
+          <w:tcPr>
+            <w:tcW w:w="6200" w:type="dxa"/>
+          </w:tcPr>
+          <w:p>
+            <w:pPr>
+              <w:pStyle w:val="Compact"/>
+            </w:pPr>
+            <w:r>
+              <w:rPr>
+                <w:lang w:val="fr-BF"/>
+              </w:rPr>
+              <w:t xml:space="preserve">Le « carnet à souches » : impossible d’avoir deux reçus portant le même numéro dans une même ferme et une même année.</w:t>
+            </w:r>
+          </w:p>
+        </w:tc>
+      </w:tr>
+      <w:tr>
+        <w:trPr>
+          <w:tblCellSpacing w:w="15" w:type="dxa"/>
+        </w:trPr>
+        <w:tc>
+          <w:tcPr>
+            <w:tcW w:w="2200" w:type="dxa"/>
+          </w:tcPr>
+          <w:p>
+            <w:pPr>
+              <w:pStyle w:val="Compact"/>
+            </w:pPr>
+            <w:r>
+              <w:rPr>
+                <w:lang w:val="fr-BF"/>
+              </w:rPr>
+              <w:t xml:space="preserve">CHECK (montant &gt; 0)</w:t>
+            </w:r>
+          </w:p>
+        </w:tc>
+        <w:tc>
+          <w:tcPr>
+            <w:tcW w:w="6200" w:type="dxa"/>
+          </w:tcPr>
+          <w:p>
+            <w:pPr>
+              <w:pStyle w:val="Compact"/>
+            </w:pPr>
+            <w:r>
+              <w:rPr>
+                <w:lang w:val="fr-BF"/>
+              </w:rPr>
+              <w:t xml:space="preserve">Faille comblée : la table acceptait auparavant un montant nul ou négatif.</w:t>
+            </w:r>
+          </w:p>
+        </w:tc>
+      </w:tr>
+      <w:tr>
+        <w:trPr>
+          <w:tblCellSpacing w:w="15" w:type="dxa"/>
+        </w:trPr>
+        <w:tc>
+          <w:tcPr>
+            <w:tcW w:w="2200" w:type="dxa"/>
+          </w:tcPr>
+          <w:p>
+            <w:pPr>
+              <w:pStyle w:val="Compact"/>
+            </w:pPr>
+            <w:r>
+              <w:rPr>
+                <w:lang w:val="fr-BF"/>
+              </w:rPr>
+              <w:t xml:space="preserve">Index sur commande_id</w:t>
+            </w:r>
+          </w:p>
+        </w:tc>
+        <w:tc>
+          <w:tcPr>
+            <w:tcW w:w="6200" w:type="dxa"/>
+          </w:tcPr>
+          <w:p>
+            <w:pPr>
+              <w:pStyle w:val="Compact"/>
+            </w:pPr>
+            <w:r>
+              <w:rPr>
+                <w:lang w:val="fr-BF"/>
+              </w:rPr>
+              <w:t xml:space="preserve">Performance — le calcul du total payé interroge les paiements d’une commande.</w:t>
+            </w:r>
+          </w:p>
+        </w:tc>
+      </w:tr>
+    </w:tbl>
+    <w:p>
+      <w:pPr>
+        <w:pStyle w:val="Titre3"/>
+      </w:pPr>
+      <w:r>
+        <w:rPr>
+          <w:b/>
+          <w:bCs/>
+          <w:lang w:val="fr-BF"/>
+        </w:rPr>
+        <w:t xml:space="preserve">19.4 Les 8 règles métier (actées — ne pas rouvrir sans demande explicite d’Adama)</w:t>
+      </w:r>
+    </w:p>
+    <w:tbl>
+      <w:tblPr>
+        <w:tblW w:w="0" w:type="auto"/>
+        <w:tblCellSpacing w:w="15" w:type="dxa"/>
+        <w:tblLook w:val="04A0" w:firstRow="1" w:lastRow="0" w:firstColumn="1" w:lastColumn="0" w:noHBand="0" w:noVBand="1"/>
+      </w:tblPr>
+      <w:tblGrid>
+        <w:gridCol w:w="600"/>
+        <w:gridCol w:w="3200"/>
+        <w:gridCol w:w="4600"/>
+      </w:tblGrid>
+      <w:tr>
+        <w:trPr>
+          <w:tblCellSpacing w:w="15" w:type="dxa"/>
+        </w:trPr>
+        <w:tc>
+          <w:tcPr>
+            <w:tcW w:w="600" w:type="dxa"/>
+          </w:tcPr>
+          <w:p>
+            <w:pPr>
+              <w:pStyle w:val="Compact"/>
+            </w:pPr>
+            <w:r>
+              <w:rPr>
+                <w:b/>
+                <w:bCs/>
+                <w:lang w:val="fr-BF"/>
+              </w:rPr>
+              <w:t xml:space="preserve">N°</w:t>
+            </w:r>
+          </w:p>
+        </w:tc>
+        <w:tc>
+          <w:tcPr>
+            <w:tcW w:w="3200" w:type="dxa"/>
+          </w:tcPr>
+          <w:p>
+            <w:pPr>
+              <w:pStyle w:val="Compact"/>
+            </w:pPr>
+            <w:r>
+              <w:rPr>
+                <w:b/>
+                <w:bCs/>
+                <w:lang w:val="fr-BF"/>
+              </w:rPr>
+              <w:t xml:space="preserve">Règle</w:t>
+            </w:r>
+          </w:p>
+        </w:tc>
+        <w:tc>
+          <w:tcPr>
+            <w:tcW w:w="4600" w:type="dxa"/>
+          </w:tcPr>
+          <w:p>
+            <w:pPr>
+              <w:pStyle w:val="Compact"/>
+            </w:pPr>
+            <w:r>
+              <w:rPr>
+                <w:b/>
+                <w:bCs/>
+                <w:lang w:val="fr-BF"/>
+              </w:rPr>
+              <w:t xml:space="preserve">Justification / détail</w:t>
+            </w:r>
+          </w:p>
+        </w:tc>
+      </w:tr>
+      <w:tr>
+        <w:trPr>
+          <w:tblCellSpacing w:w="15" w:type="dxa"/>
+        </w:trPr>
+        <w:tc>
+          <w:tcPr>
+            <w:tcW w:w="600" w:type="dxa"/>
+          </w:tcPr>
+          <w:p>
+            <w:pPr>
+              <w:pStyle w:val="Compact"/>
+            </w:pPr>
+            <w:r>
+              <w:rPr>
+                <w:lang w:val="fr-BF"/>
+              </w:rPr>
+              <w:t xml:space="preserve">1</w:t>
+            </w:r>
+          </w:p>
+        </w:tc>
+        <w:tc>
+          <w:tcPr>
+            <w:tcW w:w="3200" w:type="dxa"/>
+          </w:tcPr>
+          <w:p>
+            <w:pPr>
+              <w:pStyle w:val="Compact"/>
+            </w:pPr>
+            <w:r>
+              <w:rPr>
+                <w:lang w:val="fr-BF"/>
+              </w:rPr>
+              <w:t xml:space="preserve">Paiement possible dès le statut PLANIFIEE</w:t>
+            </w:r>
+          </w:p>
+        </w:tc>
+        <w:tc>
+          <w:tcPr>
+            <w:tcW w:w="4600" w:type="dxa"/>
+          </w:tcPr>
+          <w:p>
+            <w:pPr>
+              <w:pStyle w:val="Compact"/>
+            </w:pPr>
+            <w:r>
+              <w:rPr>
+                <w:lang w:val="fr-BF"/>
+              </w:rPr>
+              <w:t xml:space="preserve">Jamais sur une PRECOMMANDE (rien n’est encore engagé) ni sur une commande ANNULEE.</w:t>
+            </w:r>
+          </w:p>
+        </w:tc>
+      </w:tr>
+      <w:tr>
+        <w:trPr>
+          <w:tblCellSpacing w:w="15" w:type="dxa"/>
+        </w:trPr>
+        <w:tc>
+          <w:tcPr>
+            <w:tcW w:w="600" w:type="dxa"/>
+          </w:tcPr>
+          <w:p>
+            <w:pPr>
+              <w:pStyle w:val="Compact"/>
+            </w:pPr>
+            <w:r>
+              <w:rPr>
+                <w:lang w:val="fr-BF"/>
+              </w:rPr>
+              <w:t xml:space="preserve">2</w:t>
+            </w:r>
+          </w:p>
+        </w:tc>
+        <w:tc>
+          <w:tcPr>
+            <w:tcW w:w="3200" w:type="dxa"/>
+          </w:tcPr>
+          <w:p>
+            <w:pPr>
+              <w:pStyle w:val="Compact"/>
+            </w:pPr>
+            <w:r>
+              <w:rPr>
+                <w:lang w:val="fr-BF"/>
+              </w:rPr>
+              <w:t xml:space="preserve">Bouton présent uniquement si reste à payer &gt; 0</w:t>
+            </w:r>
+          </w:p>
+        </w:tc>
+        <w:tc>
+          <w:tcPr>
+            <w:tcW w:w="4600" w:type="dxa"/>
+          </w:tcPr>
+          <w:p>
+            <w:pPr>
+              <w:pStyle w:val="Compact"/>
+            </w:pPr>
+            <w:r>
+              <w:rPr>
+                <w:lang w:val="fr-BF"/>
+              </w:rPr>
+              <w:t xml:space="preserve">Une commande soldée n’affiche plus d’action de paiement — pas de sur-encaissement possible.</w:t>
+            </w:r>
+          </w:p>
+        </w:tc>
+      </w:tr>
+      <w:tr>
+        <w:trPr>
+          <w:tblCellSpacing w:w="15" w:type="dxa"/>
+        </w:trPr>
+        <w:tc>
+          <w:tcPr>
+            <w:tcW w:w="600" w:type="dxa"/>
+          </w:tcPr>
+          <w:p>
+            <w:pPr>
+              <w:pStyle w:val="Compact"/>
+            </w:pPr>
+            <w:r>
+              <w:rPr>
+                <w:lang w:val="fr-BF"/>
+              </w:rPr>
+              <w:t xml:space="preserve">3</w:t>
+            </w:r>
+          </w:p>
+        </w:tc>
+        <w:tc>
+          <w:tcPr>
+            <w:tcW w:w="3200" w:type="dxa"/>
+          </w:tcPr>
+          <w:p>
+            <w:pPr>
+              <w:pStyle w:val="Compact"/>
+            </w:pPr>
+            <w:r>
+              <w:rPr>
+                <w:lang w:val="fr-BF"/>
+              </w:rPr>
+              <w:t xml:space="preserve">Le type ACOMPTE / SOLDE est déduit, jamais saisi</w:t>
+            </w:r>
+          </w:p>
+        </w:tc>
+        <w:tc>
+          <w:tcPr>
+            <w:tcW w:w="4600" w:type="dxa"/>
+          </w:tcPr>
+          <w:p>
+            <w:pPr>
+              <w:pStyle w:val="Compact"/>
+            </w:pPr>
+            <w:r>
+              <w:rPr>
+                <w:lang w:val="fr-BF"/>
+              </w:rPr>
+              <w:t xml:space="preserve">Si le montant égale le reste à payer → SOLDE, sinon ACOMPTE. Une saisie humaine créerait des incohérences.</w:t>
+            </w:r>
+          </w:p>
+        </w:tc>
+      </w:tr>
+      <w:tr>
+        <w:trPr>
+          <w:tblCellSpacing w:w="15" w:type="dxa"/>
+        </w:trPr>
+        <w:tc>
+          <w:tcPr>
+            <w:tcW w:w="600" w:type="dxa"/>
+          </w:tcPr>
+          <w:p>
+            <w:pPr>
+              <w:pStyle w:val="Compact"/>
+            </w:pPr>
+            <w:r>
+              <w:rPr>
+                <w:lang w:val="fr-BF"/>
+              </w:rPr>
+              <w:t xml:space="preserve">4</w:t>
+            </w:r>
+          </w:p>
+        </w:tc>
+        <w:tc>
+          <w:tcPr>
+            <w:tcW w:w="3200" w:type="dxa"/>
+          </w:tcPr>
+          <w:p>
+            <w:pPr>
+              <w:pStyle w:val="Compact"/>
+            </w:pPr>
+            <w:r>
+              <w:rPr>
+                <w:lang w:val="fr-BF"/>
+              </w:rPr>
+              <w:t xml:space="preserve">Montant refusé si ≤ 0 ou &gt; reste à payer</w:t>
+            </w:r>
+          </w:p>
+        </w:tc>
+        <w:tc>
+          <w:tcPr>
+            <w:tcW w:w="4600" w:type="dxa"/>
+          </w:tcPr>
+          <w:p>
+            <w:pPr>
+              <w:pStyle w:val="Compact"/>
+            </w:pPr>
+            <w:r>
+              <w:rPr>
+                <w:lang w:val="fr-BF"/>
+              </w:rPr>
+              <w:t xml:space="preserve">Double garde : côté JS pour le message d’erreur, côté base par le CHECK (montant &gt; 0).</w:t>
+            </w:r>
+          </w:p>
+        </w:tc>
+      </w:tr>
+      <w:tr>
+        <w:trPr>
+          <w:tblCellSpacing w:w="15" w:type="dxa"/>
+        </w:trPr>
+        <w:tc>
+          <w:tcPr>
+            <w:tcW w:w="600" w:type="dxa"/>
+          </w:tcPr>
+          <w:p>
+            <w:pPr>
+              <w:pStyle w:val="Compact"/>
+            </w:pPr>
+            <w:r>
+              <w:rPr>
+                <w:lang w:val="fr-BF"/>
+              </w:rPr>
+              <w:t xml:space="preserve">5</w:t>
+            </w:r>
+          </w:p>
+        </w:tc>
+        <w:tc>
+          <w:tcPr>
+            <w:tcW w:w="3200" w:type="dxa"/>
+          </w:tcPr>
+          <w:p>
+            <w:pPr>
+              <w:pStyle w:val="Compact"/>
+            </w:pPr>
+            <w:r>
+              <w:rPr>
+                <w:lang w:val="fr-BF"/>
+              </w:rPr>
+              <w:t xml:space="preserve">Numérotation REC-{annee}-{seq sur 4 chiffres}</w:t>
+            </w:r>
+          </w:p>
+        </w:tc>
+        <w:tc>
+          <w:tcPr>
+            <w:tcW w:w="4600" w:type="dxa"/>
+          </w:tcPr>
+          <w:p>
+            <w:pPr>
+              <w:pStyle w:val="Compact"/>
+            </w:pPr>
+            <w:r>
+              <w:rPr>
+                <w:lang w:val="fr-BF"/>
+              </w:rPr>
+              <w:t xml:space="preserve">Compteur par ferme ET par an. Ex. REC-2026-0007. Voir §19.5.</w:t>
+            </w:r>
+          </w:p>
+        </w:tc>
+      </w:tr>
+      <w:tr>
+        <w:trPr>
+          <w:tblCellSpacing w:w="15" w:type="dxa"/>
+        </w:trPr>
+        <w:tc>
+          <w:tcPr>
+            <w:tcW w:w="600" w:type="dxa"/>
+          </w:tcPr>
+          <w:p>
+            <w:pPr>
+              <w:pStyle w:val="Compact"/>
+            </w:pPr>
+            <w:r>
+              <w:rPr>
+                <w:lang w:val="fr-BF"/>
+              </w:rPr>
+              <w:t xml:space="preserve">6</w:t>
+            </w:r>
+          </w:p>
+        </w:tc>
+        <w:tc>
+          <w:tcPr>
+            <w:tcW w:w="3200" w:type="dxa"/>
+          </w:tcPr>
+          <w:p>
+            <w:pPr>
+              <w:pStyle w:val="Compact"/>
+            </w:pPr>
+            <w:r>
+              <w:rPr>
+                <w:lang w:val="fr-BF"/>
+              </w:rPr>
+              <w:t xml:space="preserve">Jamais de suppression d’un paiement</w:t>
+            </w:r>
+          </w:p>
+        </w:tc>
+        <w:tc>
+          <w:tcPr>
+            <w:tcW w:w="4600" w:type="dxa"/>
+          </w:tcPr>
+          <w:p>
+            <w:pPr>
+              <w:pStyle w:val="Compact"/>
+            </w:pPr>
+            <w:r>
+              <w:rPr>
+                <w:lang w:val="fr-BF"/>
+              </w:rPr>
+              <w:t xml:space="preserve">Annulation uniquement : annule = true + motif obligatoire préfixé dans note, au format [ANNULÉ le JJ/MM/AAAA : motif]. Traçabilité comptable.</w:t>
+            </w:r>
+          </w:p>
+        </w:tc>
+      </w:tr>
+      <w:tr>
+        <w:trPr>
+          <w:tblCellSpacing w:w="15" w:type="dxa"/>
+        </w:trPr>
+        <w:tc>
+          <w:tcPr>
+            <w:tcW w:w="600" w:type="dxa"/>
+          </w:tcPr>
+          <w:p>
+            <w:pPr>
+              <w:pStyle w:val="Compact"/>
+            </w:pPr>
+            <w:r>
+              <w:rPr>
+                <w:lang w:val="fr-BF"/>
+              </w:rPr>
+              <w:t xml:space="preserve">7</w:t>
+            </w:r>
+          </w:p>
+        </w:tc>
+        <w:tc>
+          <w:tcPr>
+            <w:tcW w:w="3200" w:type="dxa"/>
+          </w:tcPr>
+          <w:p>
+            <w:pPr>
+              <w:pStyle w:val="Compact"/>
+            </w:pPr>
+            <w:r>
+              <w:rPr>
+                <w:lang w:val="fr-BF"/>
+              </w:rPr>
+              <w:t xml:space="preserve">Un paiement annulé : barré, sans bouton 📋 ni ✕, exclu du total payé</w:t>
+            </w:r>
+          </w:p>
+        </w:tc>
+        <w:tc>
+          <w:tcPr>
+            <w:tcW w:w="4600" w:type="dxa"/>
+          </w:tcPr>
+          <w:p>
+            <w:pPr>
+              <w:pStyle w:val="Compact"/>
+            </w:pPr>
+            <w:r>
+              <w:rPr>
+                <w:lang w:val="fr-BF"/>
+              </w:rPr>
+              <w:t xml:space="preserve">Il reste visible — le carnet à souches garde la souche annulée — mais ne compte plus.</w:t>
+            </w:r>
+          </w:p>
+        </w:tc>
+      </w:tr>
+      <w:tr>
+        <w:trPr>
+          <w:tblCellSpacing w:w="15" w:type="dxa"/>
+        </w:trPr>
+        <w:tc>
+          <w:tcPr>
+            <w:tcW w:w="600" w:type="dxa"/>
+          </w:tcPr>
+          <w:p>
+            <w:pPr>
+              <w:pStyle w:val="Compact"/>
+            </w:pPr>
+            <w:r>
+              <w:rPr>
+                <w:lang w:val="fr-BF"/>
+              </w:rPr>
+              <w:t xml:space="preserve">8</w:t>
+            </w:r>
+          </w:p>
+        </w:tc>
+        <w:tc>
+          <w:tcPr>
+            <w:tcW w:w="3200" w:type="dxa"/>
+          </w:tcPr>
+          <w:p>
+            <w:pPr>
+              <w:pStyle w:val="Compact"/>
+            </w:pPr>
+            <w:r>
+              <w:rPr>
+                <w:lang w:val="fr-BF"/>
+              </w:rPr>
+              <w:t xml:space="preserve">Reçu = texte copié dans le presse-papier</w:t>
+            </w:r>
+          </w:p>
+        </w:tc>
+        <w:tc>
+          <w:tcPr>
+            <w:tcW w:w="4600" w:type="dxa"/>
+          </w:tcPr>
+          <w:p>
+            <w:pPr>
+              <w:pStyle w:val="Compact"/>
+            </w:pPr>
+            <w:r>
+              <w:rPr>
+                <w:lang w:val="fr-BF"/>
+              </w:rPr>
+              <w:t xml:space="preserve">Pas de lien wa.me, pas besoin du téléphone du client. Le gérant colle où il veut (WhatsApp, SMS, e-mail).</w:t>
+            </w:r>
+          </w:p>
+        </w:tc>
+      </w:tr>
+    </w:tbl>
+    <w:p>
+      <w:pPr>
+        <w:pStyle w:val="Titre3"/>
+      </w:pPr>
+      <w:r>
+        <w:rPr>
+          <w:b/>
+          <w:bCs/>
+          <w:lang w:val="fr-BF"/>
+        </w:rPr>
+        <w:t xml:space="preserve">19.5 Numérotation des reçus — option A assumée</w:t>
+      </w:r>
+    </w:p>
+    <w:p>
+      <w:pPr>
+        <w:pStyle w:val="Corpsdetexte"/>
+      </w:pPr>
+      <w:r>
+        <w:rPr>
+          <w:lang w:val="fr-BF"/>
+        </w:rPr>
+        <w:t xml:space="preserve">Format : REC-{annee}-{numero_seq sur 4 chiffres}. Le compteur est propre à chaque ferme et redémarre à 1 chaque année.</w:t>
+      </w:r>
+    </w:p>
+    <w:p>
+      <w:pPr>
+        <w:pStyle w:val="SourceCode"/>
+      </w:pPr>
+      <w:r>
+        <w:rPr>
+          <w:rStyle w:val="VerbatimChar"/>
+          <w:lang w:val="fr-BF"/>
+        </w:rPr>
+        <w:t xml:space="preserve">REC-2026-0001</w:t>
+      </w:r>
+      <w:r>
+        <w:rPr>
+          <w:lang w:val="fr-BF"/>
+        </w:rPr>
+        <w:br/>
+      </w:r>
+      <w:r>
+        <w:rPr>
+          <w:rStyle w:val="VerbatimChar"/>
+          <w:lang w:val="fr-BF"/>
+        </w:rPr>
+        <w:t xml:space="preserve">REC-2026-0002</w:t>
+      </w:r>
+      <w:r>
+        <w:rPr>
+          <w:lang w:val="fr-BF"/>
+        </w:rPr>
+        <w:br/>
+      </w:r>
+      <w:r>
+        <w:rPr>
+          <w:rStyle w:val="VerbatimChar"/>
+          <w:lang w:val="fr-BF"/>
+        </w:rPr>
+        <w:t xml:space="preserve">…</w:t>
+      </w:r>
+      <w:r>
+        <w:rPr>
+          <w:lang w:val="fr-BF"/>
+        </w:rPr>
+        <w:br/>
+      </w:r>
+      <w:r>
+        <w:rPr>
+          <w:rStyle w:val="VerbatimChar"/>
+          <w:lang w:val="fr-BF"/>
+        </w:rPr>
+        <w:t xml:space="preserve">REC-2027-0001   (remise à zéro au changement d’année)</w:t>
+      </w:r>
+    </w:p>
+    <w:p>
+      <w:pPr>
+        <w:pStyle w:val="Corpsdetexte"/>
+      </w:pPr>
+      <w:r>
+        <w:rPr>
+          <w:lang w:val="fr-BF"/>
+        </w:rPr>
+        <w:t xml:space="preserve">Choix technique (option A, assumé) : le numéro suivant est calculé côté JS — lecture du plus grand numero_seq de la ferme pour l’année en cours, puis +1. Ce n’est pas une séquence PostgreSQL.</w:t>
+      </w:r>
+    </w:p>
+    <w:p>
+      <w:pPr>
+        <w:pStyle w:val="Corpsdetexte"/>
+      </w:pPr>
+      <w:r>
+        <w:rPr>
+          <w:b/>
+          <w:bCs/>
+          <w:lang w:val="fr-BF"/>
+        </w:rPr>
+        <w:t xml:space="preserve">⚠️ Limite connue et acceptée : deux saisies rigoureusement simultanées pourraient calculer le même numéro. La contrainte UNIQUE (ferme_id, annee, numero_seq) sert de garde-fou : la seconde insertion est alors refusée par la base plutôt que de créer un doublon. Risque jugé négligeable — un seul gérant saisit, et les paiements sont rares. Si un jour plusieurs gérants saisissent en parallèle, basculer vers une séquence côté base (option B).</w:t>
+      </w:r>
+    </w:p>
+    <w:p>
+      <w:pPr>
+        <w:pStyle w:val="Corpsdetexte"/>
+      </w:pPr>
+      <w:r>
+        <w:rPr>
+          <w:lang w:val="fr-BF"/>
+        </w:rPr>
+        <w:t xml:space="preserve">💡 En clair : c’est un carnet à souches. Chaque reçu porte un numéro qui se suit, remis à zéro chaque 1er janvier, et propre à chaque ferme. L’app regarde le dernier numéro utilisé et prend le suivant. Si par un hasard extrême deux reçus tombaient sur le même numéro, la base refuse le second au lieu de laisser passer deux souches identiques.</w:t>
+      </w:r>
+    </w:p>
+    <w:p>
+      <w:pPr>
+        <w:pStyle w:val="Titre3"/>
+      </w:pPr>
+      <w:r>
+        <w:rPr>
+          <w:b/>
+          <w:bCs/>
+          <w:lang w:val="fr-BF"/>
+        </w:rPr>
+        <w:t xml:space="preserve">19.6 Annulation d’un paiement</w:t>
+      </w:r>
+    </w:p>
+    <w:p>
+      <w:pPr>
+        <w:pStyle w:val="Corpsdetexte"/>
+      </w:pPr>
+      <w:r>
+        <w:rPr>
+          <w:lang w:val="fr-BF"/>
+        </w:rPr>
+        <w:t xml:space="preserve">Un paiement n’est jamais supprimé. L’annulation pose annule = true et préfixe le champ note avec le motif, au format imposé :</w:t>
+      </w:r>
+    </w:p>
+    <w:p>
+      <w:pPr>
+        <w:pStyle w:val="SourceCode"/>
+      </w:pPr>
+      <w:r>
+        <w:rPr>
+          <w:rStyle w:val="VerbatimChar"/>
+          <w:lang w:val="fr-BF"/>
+        </w:rPr>
+        <w:t xml:space="preserve">[ANNULÉ le 23/07/2026 : erreur de montant] note précédente…</w:t>
+      </w:r>
+    </w:p>
+    <w:p>
+      <w:pPr>
+        <w:pStyle w:val="Corpsdetexte"/>
+      </w:pPr>
+      <w:r>
+        <w:rPr>
+          <w:lang w:val="fr-BF"/>
+        </w:rPr>
+        <w:t xml:space="preserve">Le motif est obligatoire — aucune annulation « muette ». À l’écran, la ligne apparaît barrée, perd ses boutons 📋 (copier le reçu) et ✕ (annuler), et son montant sort du total payé. Le reste à payer remonte donc automatiquement.</w:t>
+      </w:r>
+    </w:p>
+    <w:p>
+      <w:pPr>
+        <w:pStyle w:val="Titre3"/>
+      </w:pPr>
+      <w:r>
+        <w:rPr>
+          <w:b/>
+          <w:bCs/>
+          <w:lang w:val="fr-BF"/>
+        </w:rPr>
+        <w:t xml:space="preserve">19.7 Le reçu</w:t>
+      </w:r>
+    </w:p>
+    <w:p>
+      <w:pPr>
+        <w:pStyle w:val="Corpsdetexte"/>
+      </w:pPr>
+      <w:r>
+        <w:rPr>
+          <w:lang w:val="fr-BF"/>
+        </w:rPr>
+        <w:t xml:space="preserve">Le reçu est un texte formaté, copié dans le presse-papier par le bouton 📋. Il porte l’identité commerciale de la ferme, lue dans la table fermes (voir §2.4 bis et §20) : nom_commercial en tête, telephone et ville en pied. Si nom_commercial est vide, le nom technique sert de repli.</w:t>
+      </w:r>
+    </w:p>
+    <w:p>
+      <w:pPr>
+        <w:pStyle w:val="Corpsdetexte"/>
+      </w:pPr>
+      <w:r>
+        <w:rPr>
+          <w:lang w:val="fr-BF"/>
+        </w:rPr>
+        <w:t xml:space="preserve">⚠️ Dépendance à connaître : le contenu du reçu dépend de l’écran Paramètres (§20). Une ferme dont le nom commercial et le téléphone ne sont pas renseignés produira un reçu incomplet, sans erreur visible.</w:t>
+      </w:r>
+    </w:p>
+    <w:p>
+      <w:pPr>
+        <w:pStyle w:val="Titre3"/>
+      </w:pPr>
+      <w:r>
+        <w:rPr>
+          <w:b/>
+          <w:bCs/>
+          <w:lang w:val="fr-BF"/>
+        </w:rPr>
+        <w:t xml:space="preserve">19.8 Fonctions et variables ajoutées à commandes.js</w:t>
+      </w:r>
+    </w:p>
+    <w:p>
+      <w:pPr>
+        <w:pStyle w:val="Corpsdetexte"/>
+      </w:pPr>
+      <w:r>
+        <w:rPr>
+          <w:lang w:val="fr-BF"/>
+        </w:rPr>
+        <w:t xml:space="preserve">Fonctions :</w:t>
+      </w:r>
+    </w:p>
+    <w:p>
+      <w:pPr>
+        <w:pStyle w:val="SourceCode"/>
+      </w:pPr>
+      <w:r>
+        <w:rPr>
+          <w:rStyle w:val="VerbatimChar"/>
+          <w:lang w:val="fr-BF"/>
+        </w:rPr>
+        <w:t xml:space="preserve">_blocReglement            _texteRecu</w:t>
+      </w:r>
+      <w:r>
+        <w:rPr>
+          <w:lang w:val="fr-BF"/>
+        </w:rPr>
+        <w:br/>
+      </w:r>
+      <w:r>
+        <w:rPr>
+          <w:rStyle w:val="VerbatimChar"/>
+          <w:lang w:val="fr-BF"/>
+        </w:rPr>
+        <w:t xml:space="preserve">_numeroRecu               _copierRecu</w:t>
+      </w:r>
+      <w:r>
+        <w:rPr>
+          <w:lang w:val="fr-BF"/>
+        </w:rPr>
+        <w:br/>
+      </w:r>
+      <w:r>
+        <w:rPr>
+          <w:rStyle w:val="VerbatimChar"/>
+          <w:lang w:val="fr-BF"/>
+        </w:rPr>
+        <w:t xml:space="preserve">_totalPaye                _chargerIdentiteFerme</w:t>
+      </w:r>
+      <w:r>
+        <w:rPr>
+          <w:lang w:val="fr-BF"/>
+        </w:rPr>
+        <w:br/>
+      </w:r>
+      <w:r>
+        <w:rPr>
+          <w:rStyle w:val="VerbatimChar"/>
+          <w:lang w:val="fr-BF"/>
+        </w:rPr>
+        <w:t xml:space="preserve">_nouveauPaiement          _annulerPaiement</w:t>
+      </w:r>
+      <w:r>
+        <w:rPr>
+          <w:lang w:val="fr-BF"/>
+        </w:rPr>
+        <w:br/>
+      </w:r>
+      <w:r>
+        <w:rPr>
+          <w:rStyle w:val="VerbatimChar"/>
+          <w:lang w:val="fr-BF"/>
+        </w:rPr>
+        <w:t xml:space="preserve">_dessinerPaiement         _dessinerAnnulPaiement</w:t>
+      </w:r>
+      <w:r>
+        <w:rPr>
+          <w:lang w:val="fr-BF"/>
+        </w:rPr>
+        <w:br/>
+      </w:r>
+      <w:r>
+        <w:rPr>
+          <w:rStyle w:val="VerbatimChar"/>
+          <w:lang w:val="fr-BF"/>
+        </w:rPr>
+        <w:t xml:space="preserve">_solderPaiement           _confirmerAnnulPaiement</w:t>
+      </w:r>
+      <w:r>
+        <w:rPr>
+          <w:lang w:val="fr-BF"/>
+        </w:rPr>
+        <w:br/>
+      </w:r>
+      <w:r>
+        <w:rPr>
+          <w:rStyle w:val="VerbatimChar"/>
+          <w:lang w:val="fr-BF"/>
+        </w:rPr>
+        <w:t xml:space="preserve">_verifierPaiement</w:t>
+      </w:r>
+      <w:r>
+        <w:rPr>
+          <w:lang w:val="fr-BF"/>
+        </w:rPr>
+        <w:br/>
+      </w:r>
+      <w:r>
+        <w:rPr>
+          <w:rStyle w:val="VerbatimChar"/>
+          <w:lang w:val="fr-BF"/>
+        </w:rPr>
+        <w:t xml:space="preserve">_dessinerConfirmationPaiement</w:t>
+      </w:r>
+      <w:r>
+        <w:rPr>
+          <w:lang w:val="fr-BF"/>
+        </w:rPr>
+        <w:br/>
+      </w:r>
+      <w:r>
+        <w:rPr>
+          <w:rStyle w:val="VerbatimChar"/>
+          <w:lang w:val="fr-BF"/>
+        </w:rPr>
+        <w:t xml:space="preserve">_confirmerPaiement</w:t>
+      </w:r>
+    </w:p>
+    <w:p>
+      <w:pPr>
+        <w:pStyle w:val="Corpsdetexte"/>
+      </w:pPr>
+      <w:r>
+        <w:rPr>
+          <w:lang w:val="fr-BF"/>
+        </w:rPr>
+        <w:t xml:space="preserve">Variables de module :</w:t>
+      </w:r>
+    </w:p>
+    <w:p>
+      <w:pPr>
+        <w:pStyle w:val="SourceCode"/>
+      </w:pPr>
+      <w:r>
+        <w:rPr>
+          <w:rStyle w:val="VerbatimChar"/>
+          <w:lang w:val="fr-BF"/>
+        </w:rPr>
+        <w:t xml:space="preserve">_detailCmd    _payCmd    _payReste    _paySaisie    _annulPay    _identiteFerme</w:t>
+      </w:r>
+    </w:p>
+    <w:p>
+      <w:pPr>
+        <w:pStyle w:val="Corpsdetexte"/>
+      </w:pPr>
+      <w:r>
+        <w:rPr>
+          <w:lang w:val="fr-BF"/>
+        </w:rPr>
+        <w:t xml:space="preserve">Rappel §17.3 : ces fonctions vivent dans un module ES. Toute fonction appelée en onclick inline doit être exposée sur window. Et l’accès Supabase passe toujours par avigestContext() au moment de s’en servir — jamais par une copie de sb mise en cache.</w:t>
+      </w:r>
+    </w:p>
+    <w:p>
+      <w:pPr>
+        <w:pStyle w:val="Titre3"/>
+      </w:pPr>
+      <w:r>
+        <w:rPr>
+          <w:b/>
+          <w:bCs/>
+          <w:lang w:val="fr-BF"/>
+        </w:rPr>
+        <w:t xml:space="preserve">19.9 Données de test en base</w:t>
+      </w:r>
+    </w:p>
+    <w:p>
+      <w:pPr>
+        <w:pStyle w:val="Corpsdetexte"/>
+      </w:pPr>
+      <w:r>
+        <w:rPr>
+          <w:lang w:val="fr-BF"/>
+        </w:rPr>
+        <w:t xml:space="preserve">⚠️ La commande « Boucherie » porte au moins un paiement annulé et un paiement soldé, créés pour tester l’affichage. Utiles pour vérifier le rendu (ligne barrée, exclusion du total), à nettoyer avant toute mise en service réelle.</w:t>
+      </w:r>
+    </w:p>
+    <w:p>
+      <w:pPr>
+        <w:pStyle w:val="Titre3"/>
+      </w:pPr>
+      <w:r>
+        <w:rPr>
+          <w:b/>
+          <w:bCs/>
+          <w:lang w:val="fr-BF"/>
+        </w:rPr>
+        <w:t xml:space="preserve">19.10 Reste à faire — alerte échéance</w:t>
+      </w:r>
+    </w:p>
+    <w:p>
+      <w:pPr>
+        <w:pStyle w:val="Corpsdetexte"/>
+      </w:pPr>
+      <w:r>
+        <w:rPr>
+          <w:lang w:val="fr-BF"/>
+        </w:rPr>
+        <w:t xml:space="preserve">Le dernier morceau de l’étape 3 CRM n’est pas commencé : l’alerte d’échéance décrite en §16.6 (rappel J-1 sur l’accueil gérant, trois couleurs, compteur sur la tuile Clients).</w:t>
+      </w:r>
+    </w:p>
+    <w:p>
+      <w:pPr>
+        <w:pStyle w:val="Corpsdetexte"/>
+      </w:pPr>
+      <w:r>
+        <w:rPr>
+          <w:b/>
+          <w:bCs/>
+          <w:lang w:val="fr-BF"/>
+        </w:rPr>
+        <w:t xml:space="preserve">⚠️ Deux points à diagnostiquer AVANT de coder : (1) l’alerte s’appuie sur commandes.date_reglement_prevue, à ne pas confondre avec date_livraison_prevue (§18.4) ; (2) il n’est pas certain qu’un écran permette aujourd’hui de SAISIR date_reglement_prevue — si la colonne reste vide, l’alerte n’aura rien à afficher. Vérifier en base et dans le code avant tout développement.</w:t>
+      </w:r>
+    </w:p>
+    <w:p>
+      <w:pPr>
+        <w:pStyle w:val="Corpsdetexte"/>
+      </w:pPr>
+      <w:r>
+        <w:rPr>
+          <w:lang w:val="fr-BF"/>
+        </w:rPr>
+        <w:t xml:space="preserve">⚠️ Terrain différent : l’accueil gérant vit dans index.html (~5900 lignes), pas dans les modules ES. Voir §17 pour la frontière entre les deux mondes.</w:t>
+      </w:r>
+    </w:p>
+    <w:p>
+      <w:pPr>
+        <w:pStyle w:val="Titre2"/>
+      </w:pPr>
+      <w:r>
+        <w:rPr>
+          <w:b/>
+          <w:bCs/>
+          <w:lang w:val="fr-BF"/>
+        </w:rPr>
+        <w:t xml:space="preserve">20. Écran Paramètres — identité commerciale de la ferme (v26.34)</w:t>
+      </w:r>
+    </w:p>
+    <w:p>
+      <w:pPr>
+        <w:pStyle w:val="Titre3"/>
+      </w:pPr>
+      <w:r>
+        <w:rPr>
+          <w:b/>
+          <w:bCs/>
+          <w:lang w:val="fr-BF"/>
+        </w:rPr>
+        <w:t xml:space="preserve">20.1 Objectif</w:t>
+      </w:r>
+    </w:p>
+    <w:p>
+      <w:pPr>
+        <w:pStyle w:val="Corpsdetexte"/>
+      </w:pPr>
+      <w:r>
+        <w:rPr>
+          <w:lang w:val="fr-BF"/>
+        </w:rPr>
+        <w:t xml:space="preserve">Premier écran de configuration d’AviGest. Il permet au gérant de renseigner l’identité commerciale de sa ferme — celle qui apparaît sur les documents remis aux clients, à commencer par les reçus de paiement (§19.7).</w:t>
+      </w:r>
+    </w:p>
+    <w:p>
+      <w:pPr>
+        <w:pStyle w:val="Corpsdetexte"/>
+      </w:pPr>
+      <w:r>
+        <w:rPr>
+          <w:lang w:val="fr-BF"/>
+        </w:rPr>
+        <w:t xml:space="preserve">Né d’un besoin concret : le reçu devait porter un nom lisible par le client (« Kalycoq ») plutôt que le nom technique du tenant (« REVAGRO »), sans avoir à modifier la base à la main.</w:t>
+      </w:r>
+    </w:p>
+    <w:p>
+      <w:pPr>
+        <w:pStyle w:val="Corpsdetexte"/>
+      </w:pPr>
+      <w:r>
+        <w:rPr>
+          <w:b/>
+          <w:bCs/>
+          <w:lang w:val="fr-BF"/>
+        </w:rPr>
+        <w:t xml:space="preserve">Seul le GÉRANT y accède. Onglet GESTION, tuile ⚙️. Module js/parametres/parametres.js.</w:t>
+      </w:r>
+    </w:p>
+    <w:p>
+      <w:pPr>
+        <w:pStyle w:val="Corpsdetexte"/>
+      </w:pPr>
+      <w:r>
+        <w:rPr>
+          <w:lang w:val="fr-BF"/>
+        </w:rPr>
+        <w:t xml:space="preserve">💡 En clair : c’est la page « en-tête de papier à lettres ». Tu y écris une fois le nom commercial et le téléphone de ta ferme, et ça s’imprime tout seul en haut de chaque reçu remis à un client.</w:t>
+      </w:r>
+    </w:p>
+    <w:p>
+      <w:pPr>
+        <w:pStyle w:val="Titre3"/>
+      </w:pPr>
+      <w:r>
+        <w:rPr>
+          <w:b/>
+          <w:bCs/>
+          <w:lang w:val="fr-BF"/>
+        </w:rPr>
+        <w:t xml:space="preserve">20.2 Migration 047</w:t>
+      </w:r>
+    </w:p>
+    <w:p>
+      <w:pPr>
+        <w:pStyle w:val="Corpsdetexte"/>
+      </w:pPr>
+      <w:r>
+        <w:rPr>
+          <w:lang w:val="fr-BF"/>
+        </w:rPr>
+        <w:t xml:space="preserve">Fichier : 047_fermes_nom_commercial.sql. Une seule colonne ajoutée à la table fermes :</w:t>
+      </w:r>
+    </w:p>
+    <w:p>
+      <w:pPr>
+        <w:pStyle w:val="SourceCode"/>
+      </w:pPr>
+      <w:r>
+        <w:rPr>
+          <w:rStyle w:val="VerbatimChar"/>
+          <w:lang w:val="fr-BF"/>
+        </w:rPr>
+        <w:t xml:space="preserve">ALTER TABLE fermes ADD COLUMN nom_commercial text;   -- nullable</w:t>
+      </w:r>
+    </w:p>
+    <w:p>
+      <w:pPr>
+        <w:pStyle w:val="Corpsdetexte"/>
+      </w:pPr>
+      <w:r>
+        <w:rPr>
+          <w:b/>
+          <w:bCs/>
+          <w:lang w:val="fr-BF"/>
+        </w:rPr>
+        <w:t xml:space="preserve">⚠️ Leçon de diagnostic : la table contenait DÉJÀ nom, proprietaire, telephone, ville, pays et email. Aucune autre colonne n’était nécessaire. La policy fermes_update existait également déjà — aucun ajout RLS. Sans la vérification préalable en base (règle absolue n°1), la migration aurait tenté de recréer des colonnes existantes et échoué en bloc, une migration étant transactionnelle (§4.1).</w:t>
+      </w:r>
+    </w:p>
+    <w:p>
+      <w:pPr>
+        <w:pStyle w:val="Corpsdetexte"/>
+      </w:pPr>
+      <w:r>
+        <w:rPr>
+          <w:lang w:val="fr-BF"/>
+        </w:rPr>
+        <w:t xml:space="preserve">Schéma complet de la table fermes : voir §2.4 bis.</w:t>
+      </w:r>
+    </w:p>
+    <w:p>
+      <w:pPr>
+        <w:pStyle w:val="Titre3"/>
+      </w:pPr>
+      <w:r>
+        <w:rPr>
+          <w:b/>
+          <w:bCs/>
+          <w:lang w:val="fr-BF"/>
+        </w:rPr>
+        <w:t xml:space="preserve">20.3 Les trois champs modifiables</w:t>
+      </w:r>
+    </w:p>
+    <w:tbl>
+      <w:tblPr>
+        <w:tblW w:w="0" w:type="auto"/>
+        <w:tblCellSpacing w:w="15" w:type="dxa"/>
+        <w:tblLook w:val="04A0" w:firstRow="1" w:lastRow="0" w:firstColumn="1" w:lastColumn="0" w:noHBand="0" w:noVBand="1"/>
+      </w:tblPr>
+      <w:tblGrid>
+        <w:gridCol w:w="2000"/>
+        <w:gridCol w:w="2600"/>
+        <w:gridCol w:w="3800"/>
+      </w:tblGrid>
+      <w:tr>
+        <w:trPr>
+          <w:tblCellSpacing w:w="15" w:type="dxa"/>
+        </w:trPr>
+        <w:tc>
+          <w:tcPr>
+            <w:tcW w:w="2000" w:type="dxa"/>
+          </w:tcPr>
+          <w:p>
+            <w:pPr>
+              <w:pStyle w:val="Compact"/>
+            </w:pPr>
+            <w:r>
+              <w:rPr>
+                <w:b/>
+                <w:bCs/>
+                <w:lang w:val="fr-BF"/>
+              </w:rPr>
+              <w:t xml:space="preserve">Champ</w:t>
+            </w:r>
+          </w:p>
+        </w:tc>
+        <w:tc>
+          <w:tcPr>
+            <w:tcW w:w="2600" w:type="dxa"/>
+          </w:tcPr>
+          <w:p>
+            <w:pPr>
+              <w:pStyle w:val="Compact"/>
+            </w:pPr>
+            <w:r>
+              <w:rPr>
+                <w:b/>
+                <w:bCs/>
+                <w:lang w:val="fr-BF"/>
+              </w:rPr>
+              <w:t xml:space="preserve">Colonne</w:t>
+            </w:r>
+          </w:p>
+        </w:tc>
+        <w:tc>
+          <w:tcPr>
+            <w:tcW w:w="3800" w:type="dxa"/>
+          </w:tcPr>
+          <w:p>
+            <w:pPr>
+              <w:pStyle w:val="Compact"/>
+            </w:pPr>
+            <w:r>
+              <w:rPr>
+                <w:b/>
+                <w:bCs/>
+                <w:lang w:val="fr-BF"/>
+              </w:rPr>
+              <w:t xml:space="preserve">Usage</w:t>
+            </w:r>
+          </w:p>
+        </w:tc>
+      </w:tr>
+      <w:tr>
+        <w:trPr>
+          <w:tblCellSpacing w:w="15" w:type="dxa"/>
+        </w:trPr>
+        <w:tc>
+          <w:tcPr>
+            <w:tcW w:w="2000" w:type="dxa"/>
+          </w:tcPr>
+          <w:p>
+            <w:pPr>
+              <w:pStyle w:val="Compact"/>
+            </w:pPr>
+            <w:r>
+              <w:rPr>
+                <w:lang w:val="fr-BF"/>
+              </w:rPr>
+              <w:t xml:space="preserve">Nom commercial</w:t>
+            </w:r>
+          </w:p>
+        </w:tc>
+        <w:tc>
+          <w:tcPr>
+            <w:tcW w:w="2600" w:type="dxa"/>
+          </w:tcPr>
+          <w:p>
+            <w:pPr>
+              <w:pStyle w:val="Compact"/>
+            </w:pPr>
+            <w:r>
+              <w:rPr>
+                <w:lang w:val="fr-BF"/>
+              </w:rPr>
+              <w:t xml:space="preserve">fermes.nom_commercial</w:t>
+            </w:r>
+          </w:p>
+        </w:tc>
+        <w:tc>
+          <w:tcPr>
+            <w:tcW w:w="3800" w:type="dxa"/>
+          </w:tcPr>
+          <w:p>
+            <w:pPr>
+              <w:pStyle w:val="Compact"/>
+            </w:pPr>
+            <w:r>
+              <w:rPr>
+                <w:lang w:val="fr-BF"/>
+              </w:rPr>
+              <w:t xml:space="preserve">Tête du reçu de paiement. Repli sur fermes.nom si vide.</w:t>
+            </w:r>
+          </w:p>
+        </w:tc>
+      </w:tr>
+      <w:tr>
+        <w:trPr>
+          <w:tblCellSpacing w:w="15" w:type="dxa"/>
+        </w:trPr>
+        <w:tc>
+          <w:tcPr>
+            <w:tcW w:w="2000" w:type="dxa"/>
+          </w:tcPr>
+          <w:p>
+            <w:pPr>
+              <w:pStyle w:val="Compact"/>
+            </w:pPr>
+            <w:r>
+              <w:rPr>
+                <w:lang w:val="fr-BF"/>
+              </w:rPr>
+              <w:t xml:space="preserve">Téléphone</w:t>
+            </w:r>
+          </w:p>
+        </w:tc>
+        <w:tc>
+          <w:tcPr>
+            <w:tcW w:w="2600" w:type="dxa"/>
+          </w:tcPr>
+          <w:p>
+            <w:pPr>
+              <w:pStyle w:val="Compact"/>
+            </w:pPr>
+            <w:r>
+              <w:rPr>
+                <w:lang w:val="fr-BF"/>
+              </w:rPr>
+              <w:t xml:space="preserve">fermes.telephone</w:t>
+            </w:r>
+          </w:p>
+        </w:tc>
+        <w:tc>
+          <w:tcPr>
+            <w:tcW w:w="3800" w:type="dxa"/>
+          </w:tcPr>
+          <w:p>
+            <w:pPr>
+              <w:pStyle w:val="Compact"/>
+            </w:pPr>
+            <w:r>
+              <w:rPr>
+                <w:lang w:val="fr-BF"/>
+              </w:rPr>
+              <w:t xml:space="preserve">Pied du reçu de paiement.</w:t>
+            </w:r>
+          </w:p>
+        </w:tc>
+      </w:tr>
+      <w:tr>
+        <w:trPr>
+          <w:tblCellSpacing w:w="15" w:type="dxa"/>
+        </w:trPr>
+        <w:tc>
+          <w:tcPr>
+            <w:tcW w:w="2000" w:type="dxa"/>
+          </w:tcPr>
+          <w:p>
+            <w:pPr>
+              <w:pStyle w:val="Compact"/>
+            </w:pPr>
+            <w:r>
+              <w:rPr>
+                <w:lang w:val="fr-BF"/>
+              </w:rPr>
+              <w:t xml:space="preserve">Ville</w:t>
+            </w:r>
+          </w:p>
+        </w:tc>
+        <w:tc>
+          <w:tcPr>
+            <w:tcW w:w="2600" w:type="dxa"/>
+          </w:tcPr>
+          <w:p>
+            <w:pPr>
+              <w:pStyle w:val="Compact"/>
+            </w:pPr>
+            <w:r>
+              <w:rPr>
+                <w:lang w:val="fr-BF"/>
+              </w:rPr>
+              <w:t xml:space="preserve">fermes.ville</w:t>
+            </w:r>
+          </w:p>
+        </w:tc>
+        <w:tc>
+          <w:tcPr>
+            <w:tcW w:w="3800" w:type="dxa"/>
+          </w:tcPr>
+          <w:p>
+            <w:pPr>
+              <w:pStyle w:val="Compact"/>
+            </w:pPr>
+            <w:r>
+              <w:rPr>
+                <w:lang w:val="fr-BF"/>
+              </w:rPr>
+              <w:t xml:space="preserve">Pied du reçu. Default en base : ‘Ouagadougou’.</w:t>
+            </w:r>
+          </w:p>
+        </w:tc>
+      </w:tr>
+    </w:tbl>
+    <w:p>
+      <w:pPr>
+        <w:pStyle w:val="Corpsdetexte"/>
+      </w:pPr>
+      <w:r>
+        <w:rPr>
+          <w:lang w:val="fr-BF"/>
+        </w:rPr>
+        <w:t xml:space="preserve">⚠️ Les autres colonnes de fermes (nom technique, proprietaire, pays, email, plan, nb_batiments, code_acces, actif) ne sont PAS modifiables depuis cet écran. code_acces en particulier commande le login par code ferme : le rendre éditable exposerait au risque de verrouiller une ferme entière hors de l’application.</w:t>
+      </w:r>
+    </w:p>
+    <w:p>
+      <w:pPr>
+        <w:pStyle w:val="Titre3"/>
+      </w:pPr>
+      <w:r>
+        <w:rPr>
+          <w:b/>
+          <w:bCs/>
+          <w:lang w:val="fr-BF"/>
+        </w:rPr>
+        <w:t xml:space="preserve">20.4 Branchement dans l’onglet GESTION</w:t>
+      </w:r>
+    </w:p>
+    <w:p>
+      <w:pPr>
+        <w:pStyle w:val="Corpsdetexte"/>
+      </w:pPr>
+      <w:r>
+        <w:rPr>
+          <w:lang w:val="fr-BF"/>
+        </w:rPr>
+        <w:t xml:space="preserve">Une tuile ⚙️ a été ajoutée dans js/gestion/gestion.js, aux côtés des tuiles existantes (Clients, Commandes…). Le module suit exactement les conventions du §17 :</w:t>
+      </w:r>
+    </w:p>
+    <w:p>
+      <w:pPr>
+        <w:pStyle w:val="Corpsdetexte"/>
+      </w:pPr>
+      <w:r>
+        <w:rPr>
+          <w:lang w:val="fr-BF"/>
+        </w:rPr>
+        <w:t xml:space="preserve">• vrai module ES dans son propre dossier js/parametres/ ; • accès Supabase via avigestContext() appelé au moment de s’en servir, jamais mis en cache ; • une seule porte d’entrée exposée sur window ; • toute fonction appelée en onclick inline exposée sur window.</w:t>
+      </w:r>
+    </w:p>
+    <w:p>
+      <w:pPr>
+        <w:pStyle w:val="Titre3"/>
+      </w:pPr>
+      <w:r>
+        <w:rPr>
+          <w:b/>
+          <w:bCs/>
+          <w:lang w:val="fr-BF"/>
+        </w:rPr>
+        <w:t xml:space="preserve">20.5 Point de vigilance — relecture des valeurs enregistrées</w:t>
+      </w:r>
+    </w:p>
+    <w:p>
+      <w:pPr>
+        <w:pStyle w:val="Corpsdetexte"/>
+      </w:pPr>
+      <w:r>
+        <w:rPr>
+          <w:b/>
+          <w:bCs/>
+          <w:lang w:val="fr-BF"/>
+        </w:rPr>
+        <w:t xml:space="preserve">⚠️ Constat non tranché à la clôture de la v26.34 : sur une capture d’écran de vérification, le champ « Nom commercial » paraissait vide (placeholder gris) alors que le reçu affichait bien « Kalycoq », et le champ Téléphone vide alors que le reçu portait le numéro.</w:t>
+      </w:r>
+    </w:p>
+    <w:p>
+      <w:pPr>
+        <w:pStyle w:val="Corpsdetexte"/>
+      </w:pPr>
+      <w:r>
+        <w:rPr>
+          <w:lang w:val="fr-BF"/>
+        </w:rPr>
+        <w:t xml:space="preserve">Deux hypothèses : soit la capture a été prise avant l’enregistrement, soit la fonction de rendu de l’écran ne relit pas correctement la ligne fermes au chargement. L’écriture fonctionne — c’est prouvé par le reçu, qui lit les mêmes colonnes. Le doute ne porte que sur la relecture.</w:t>
+      </w:r>
+    </w:p>
+    <w:p>
+      <w:pPr>
+        <w:pStyle w:val="Corpsdetexte"/>
+      </w:pPr>
+      <w:r>
+        <w:rPr>
+          <w:lang w:val="fr-BF"/>
+        </w:rPr>
+        <w:t xml:space="preserve">Test de contrôle : GESTION → ⚙️ Paramètres. Les trois champs doivent afficher les valeurs enregistrées en texte plein, pas en gris de placeholder. Si les champs sont gris alors que le reçu est correct, le défaut est dans la relecture.</w:t>
+      </w:r>
+    </w:p>
+    <w:p>
+      <w:pPr>
+        <w:pStyle w:val="Corpsdetexte"/>
+      </w:pPr>
+      <w:r>
+        <w:rPr>
+          <w:lang w:val="fr-BF"/>
+        </w:rPr>
+        <w:t xml:space="preserve">💡 En clair : l’information est bien écrite dans la base — la preuve, elle sort sur les reçus. Le doute, c’est de savoir si l’écran de réglage sait la relire quand on y revient. Sinon le gérant croit ses réglages perdus et les ressaisit inutilement.</w:t>
+      </w:r>
+    </w:p>
+    <w:p>
+      <w:pPr>
+        <w:pStyle w:val="Titre3"/>
+      </w:pPr>
+      <w:r>
+        <w:rPr>
+          <w:b/>
+          <w:bCs/>
+          <w:lang w:val="fr-BF"/>
+        </w:rPr>
+        <w:t xml:space="preserve">20.6 Perspective</w:t>
+      </w:r>
+    </w:p>
+    <w:p>
+      <w:pPr>
+        <w:pStyle w:val="Corpsdetexte"/>
+      </w:pPr>
+      <w:r>
+        <w:rPr>
+          <w:lang w:val="fr-BF"/>
+        </w:rPr>
+        <w:t xml:space="preserve">Cet écran est le point d’entrée naturel des futurs réglages de ferme. Deux colonnes déjà présentes en base l’attendent : plan (default ‘FREE’) et nb_batiments (default 6), toutes deux inexploitées à ce jour. Elles constituent le socle du modèle tarifaire SaaS (§13.5) — à exposer ici le moment venu, en lecture seule pour le gérant.</w:t>
+      </w:r>
+    </w:p>
+    <w:p>
+      <w:pPr>
         <w:pStyle w:val="Corpsdetexte"/>
         <w:rPr>
           <w:b/>
@@ -16387,13 +20705,13 @@
           <w:bCs/>
           <w:lang w:val="fr-BF"/>
         </w:rPr>
-        <w:t xml:space="preserve">🐛 Bug cosmétique score santé (balises &lt;strong&gt; brutes)</w:t>
-      </w:r>
-      <w:r>
-        <w:rPr>
-          <w:lang w:val="fr-BF"/>
-        </w:rPr>
-        <w:t xml:space="preserve"> — toujours ouvert, priorité moyenne (~5 min). Écran confirmation agent affiche « &lt;strong&gt;BON&lt;/strong&gt; » au lieu de BON en gras. Cause : esc() échappe les balises dans _renderSessionResume(). Correctif : retirer les &lt;strong&gt;/&lt;/strong&gt; (le CSS .rapport-ligne span:last-child gère déjà le gras). Chercher « Santé du lot » dans index.html.</w:t>
+        <w:t xml:space="preserve">✅ Bug cosmétique score santé (balises &lt;strong&gt; brutes) — FERMÉ v26.30</w:t>
+      </w:r>
+      <w:r>
+        <w:rPr>
+          <w:lang w:val="fr-BF"/>
+        </w:rPr>
+        <w:t xml:space="preserve"> — corrigé en v26.30. Les balises &lt;strong&gt;/&lt;/strong&gt; ont été retirées de _renderSessionResume() (le CSS .rapport-ligne span:last-child gère déjà le gras). ⚠️ Leçon : DEUX balises étaient en cause, pas une — toujours compter les occurrences avant de conclure qu’un correctif est complet.</w:t>
       </w:r>
     </w:p>
     <w:p>

</xml_diff>

<commit_message>
v26.35 - Bible : section 21 (service worker), point n°6 ferme, version v26.35
</commit_message>
<xml_diff>
--- a/bible_avigest_v26.docx
+++ b/bible_avigest_v26.docx
@@ -689,7 +689,7 @@
                 <w:bCs/>
                 <w:lang w:val="fr-FR"/>
               </w:rPr>
-              <w:t>APP_VERSION = ‘v26.34’ · CACHE_NAME = ‘avigest-v26-34’</w:t>
+              <w:t>APP_VERSION = ‘v26.35’ · CACHE_NAME = ‘avigest-v26-35’</w:t>
             </w:r>
           </w:p>
         </w:tc>
@@ -16162,41 +16162,13 @@
           <w:bCs/>
           <w:lang w:val="fr-BF"/>
         </w:rPr>
-        <w:t>sw.js — STATIC_URLS incomplet</w:t>
-      </w:r>
-      <w:r>
-        <w:rPr>
-          <w:lang w:val="fr-BF"/>
-        </w:rPr>
-        <w:t xml:space="preserve"> (ouvert v26.22) : la liste ne contient que /AVIGEST4/ et /AVIGEST4/index.html. Aucun fichier de module n’y figure : css/gestion.css, js/shared/db.js, js/shared/helpers.js, js/gestion/gestion.js, js/clients/, js/commandes/commandes.js et js/parametres/parametres.js. ⚠️ Point AGGRAVÉ à chaque nouveau module (mis à jour v26.35). </w:t>
-      </w:r>
-      <w:r>
-        <w:rPr>
-          <w:b/>
-          <w:bCs/>
-          <w:lang w:val="fr-BF"/>
-        </w:rPr>
-        <w:t>Conséquence</w:t>
-      </w:r>
-      <w:r>
-        <w:rPr>
-          <w:lang w:val="fr-BF"/>
-        </w:rPr>
-        <w:t xml:space="preserve"> : le module GESTION </w:t>
-      </w:r>
-      <w:r>
-        <w:rPr>
-          <w:b/>
-          <w:bCs/>
-          <w:lang w:val="fr-BF"/>
-        </w:rPr>
-        <w:t>ne fonctionnera pas hors ligne</w:t>
-      </w:r>
-      <w:r>
-        <w:rPr>
-          <w:lang w:val="fr-BF"/>
-        </w:rPr>
-        <w:t xml:space="preserve">. Fonctionne correctement en ligne (testé en production le 11/07/2026, fenêtre InPrivate). À corriger dans un commit dédié.</w:t>
+        <w:t xml:space="preserve">sw.js — STATIC_URLS incomplet — ✅ RÉSOLU v26.35</w:t>
+      </w:r>
+      <w:r>
+        <w:rPr>
+          <w:lang w:val="fr-BF"/>
+        </w:rPr>
+        <w:t xml:space="preserve"> (ouvert v26.22, fermé v26.35). La liste ne contenait que /AVIGEST4/ et /AVIGEST4/index.html — elle compte désormais 9 entrées, tous les modules ES inclus. Voir §21 pour le détail du correctif.</w:t>
       </w:r>
     </w:p>
     <w:p>
@@ -17813,7 +17785,7 @@
           <w:bCs/>
           <w:lang w:val="fr-BF"/>
         </w:rPr>
-        <w:t xml:space="preserve">Version actuelle : APP_VERSION = 'v26.34' · CACHE_NAME = 'avigest-v26-34'</w:t>
+        <w:t xml:space="preserve">Version actuelle : APP_VERSION = 'v26.35' · CACHE_NAME = 'avigest-v26-35'</w:t>
       </w:r>
       <w:r>
         <w:rPr>
@@ -20650,6 +20622,329 @@
           <w:lang w:val="fr-BF"/>
         </w:rPr>
         <w:t xml:space="preserve">Cet écran est le point d’entrée naturel des futurs réglages de ferme. Deux colonnes déjà présentes en base l’attendent : plan (default ‘FREE’) et nb_batiments (default 6), toutes deux inexploitées à ce jour. Elles constituent le socle du modèle tarifaire SaaS (§13.5) — à exposer ici le moment venu, en lecture seule pour le gérant.</w:t>
+      </w:r>
+    </w:p>
+    <w:p>
+      <w:pPr>
+        <w:pStyle w:val="Titre2"/>
+      </w:pPr>
+      <w:r>
+        <w:rPr>
+          <w:b/>
+          <w:bCs/>
+          <w:lang w:val="fr-BF"/>
+        </w:rPr>
+        <w:t xml:space="preserve">21. Service Worker et cache hors ligne (v26.35)</w:t>
+      </w:r>
+    </w:p>
+    <w:p>
+      <w:pPr>
+        <w:pStyle w:val="Titre3"/>
+      </w:pPr>
+      <w:r>
+        <w:rPr>
+          <w:b/>
+          <w:bCs/>
+          <w:lang w:val="fr-BF"/>
+        </w:rPr>
+        <w:t xml:space="preserve">21.1 Ce qui a été corrigé</w:t>
+      </w:r>
+    </w:p>
+    <w:p>
+      <w:pPr>
+        <w:pStyle w:val="Corpsdetexte"/>
+      </w:pPr>
+      <w:r>
+        <w:rPr>
+          <w:lang w:val="fr-BF"/>
+        </w:rPr>
+        <w:t xml:space="preserve">Le point en suspens n°6, ouvert depuis la v26.22 et aggravé à chaque nouveau module, est fermé. Quatre corrections dans sw.js, en un seul commit dédié :</w:t>
+      </w:r>
+    </w:p>
+    <w:p>
+      <w:pPr>
+        <w:pStyle w:val="Corpsdetexte"/>
+      </w:pPr>
+      <w:r>
+        <w:rPr>
+          <w:lang w:val="fr-BF"/>
+        </w:rPr>
+        <w:t xml:space="preserve">1) CACHE_NAME porté à avigest-v26-35, en même temps qu’APP_VERSION dans index.html (règle §4.3). 2) STATIC_URLS passé de 2 à 9 entrées : css/gestion.css, js/shared/db.js, js/shared/helpers.js, js/gestion/gestion.js, js/clients/clients.js, js/commandes/commandes.js, js/parametres/parametres.js. 3) Installation rendue tolérante (voir §21.2). 4) Mise en cache conditionnée à resp.ok, et repli explicite si le cache est vide (voir §21.3).</w:t>
+      </w:r>
+    </w:p>
+    <w:p>
+      <w:pPr>
+        <w:pStyle w:val="Titre3"/>
+      </w:pPr>
+      <w:r>
+        <w:rPr>
+          <w:b/>
+          <w:bCs/>
+          <w:lang w:val="fr-BF"/>
+        </w:rPr>
+        <w:t xml:space="preserve">21.2 cache.addAll → Promise.allSettled — le point important</w:t>
+      </w:r>
+    </w:p>
+    <w:p>
+      <w:pPr>
+        <w:pStyle w:val="Corpsdetexte"/>
+      </w:pPr>
+      <w:r>
+        <w:rPr>
+          <w:b/>
+          <w:bCs/>
+          <w:lang w:val="fr-BF"/>
+        </w:rPr>
+        <w:t xml:space="preserve">L’ancienne installation utilisait cache.addAll(STATIC_URLS). Cette méthode est tout-ou-rien : si UNE seule URL de la liste est introuvable, la promesse est rejetée et AUCUN fichier n’est mis en cache — le service worker ne s’installe pas du tout. Avec une liste de 2 entrées le risque était faible ; avec 9, une faute de frappe suffisait à faire perdre tout le cache, y compris ce qui fonctionnait avant.</w:t>
+      </w:r>
+    </w:p>
+    <w:p>
+      <w:pPr>
+        <w:pStyle w:val="SourceCode"/>
+      </w:pPr>
+      <w:r>
+        <w:rPr>
+          <w:rStyle w:val="VerbatimChar"/>
+          <w:lang w:val="fr-BF"/>
+        </w:rPr>
+        <w:t xml:space="preserve">caches.open(CACHE_NAME)</w:t>
+      </w:r>
+      <w:r>
+        <w:rPr>
+          <w:lang w:val="fr-BF"/>
+        </w:rPr>
+        <w:br/>
+      </w:r>
+      <w:r>
+        <w:rPr>
+          <w:rStyle w:val="VerbatimChar"/>
+          <w:lang w:val="fr-BF"/>
+        </w:rPr>
+        <w:t xml:space="preserve">  .then(cache =&gt; Promise.allSettled(STATIC_URLS.map(u =&gt; cache.add(u))))</w:t>
+      </w:r>
+      <w:r>
+        <w:rPr>
+          <w:lang w:val="fr-BF"/>
+        </w:rPr>
+        <w:br/>
+      </w:r>
+      <w:r>
+        <w:rPr>
+          <w:rStyle w:val="VerbatimChar"/>
+          <w:lang w:val="fr-BF"/>
+        </w:rPr>
+        <w:t xml:space="preserve">  .then(() =&gt; self.skipWaiting());</w:t>
+      </w:r>
+    </w:p>
+    <w:p>
+      <w:pPr>
+        <w:pStyle w:val="Corpsdetexte"/>
+      </w:pPr>
+      <w:r>
+        <w:rPr>
+          <w:lang w:val="fr-BF"/>
+        </w:rPr>
+        <w:t xml:space="preserve">Chaque fichier est désormais tenté séparément. Un chemin faux échoue seul, sans empêcher les autres d’être mis en cache. Conséquence pratique : ajouter un module à STATIC_URLS n’est plus une opération risquée.</w:t>
+      </w:r>
+    </w:p>
+    <w:p>
+      <w:pPr>
+        <w:pStyle w:val="Corpsdetexte"/>
+      </w:pPr>
+      <w:r>
+        <w:rPr>
+          <w:lang w:val="fr-BF"/>
+        </w:rPr>
+        <w:t xml:space="preserve">💡 En clair : avant, si un seul produit manquait à la livraison, le magasinier refusait de ranger toute la palette. Maintenant il range ce qu’il a et met de côté ce qui manque.</w:t>
+      </w:r>
+    </w:p>
+    <w:p>
+      <w:pPr>
+        <w:pStyle w:val="Titre3"/>
+      </w:pPr>
+      <w:r>
+        <w:rPr>
+          <w:b/>
+          <w:bCs/>
+          <w:lang w:val="fr-BF"/>
+        </w:rPr>
+        <w:t xml:space="preserve">21.3 Stratégie fetch — ce qui était déjà bon, ce qui ne l’était pas</w:t>
+      </w:r>
+    </w:p>
+    <w:p>
+      <w:pPr>
+        <w:pStyle w:val="Corpsdetexte"/>
+      </w:pPr>
+      <w:r>
+        <w:rPr>
+          <w:lang w:val="fr-BF"/>
+        </w:rPr>
+        <w:t xml:space="preserve">Découverte du diagnostic : la stratégie était déjà « réseau d’abord, puis mise en cache de la réponse ». Tous les modules étaient donc déjà cachés automatiquement dès la première visite en ligne. STATIC_URLS ne sert qu’au PRÉ-chargement à l’installation — il couvre le cas où l’utilisateur perd le réseau avant d’avoir ouvert l’écran concerné.</w:t>
+      </w:r>
+    </w:p>
+    <w:p>
+      <w:pPr>
+        <w:pStyle w:val="Corpsdetexte"/>
+      </w:pPr>
+      <w:r>
+        <w:rPr>
+          <w:lang w:val="fr-BF"/>
+        </w:rPr>
+        <w:t xml:space="preserve">Deux défauts réels ont été corrigés au passage :</w:t>
+      </w:r>
+    </w:p>
+    <w:p>
+      <w:pPr>
+        <w:pStyle w:val="Corpsdetexte"/>
+      </w:pPr>
+      <w:r>
+        <w:rPr>
+          <w:lang w:val="fr-BF"/>
+        </w:rPr>
+        <w:t xml:space="preserve">• Toutes les réponses étaient mises en cache, y compris les 404 — une erreur pouvait donc être resservie indéfiniment. Un test resp.ok a été ajouté. • En cas d’échec réseau ET de cache vide, caches.match() renvoyait undefined, et respondWith(undefined) provoquait une erreur brute. Une réponse 503 explicite est désormais renvoyée.</w:t>
+      </w:r>
+    </w:p>
+    <w:p>
+      <w:pPr>
+        <w:pStyle w:val="Titre3"/>
+      </w:pPr>
+      <w:r>
+        <w:rPr>
+          <w:b/>
+          <w:bCs/>
+          <w:lang w:val="fr-BF"/>
+        </w:rPr>
+        <w:t xml:space="preserve">21.4 ⚠️ Règle de test — NE PAS tester le cache en InPrivate</w:t>
+      </w:r>
+    </w:p>
+    <w:p>
+      <w:pPr>
+        <w:pStyle w:val="Corpsdetexte"/>
+      </w:pPr>
+      <w:r>
+        <w:rPr>
+          <w:b/>
+          <w:bCs/>
+          <w:lang w:val="fr-BF"/>
+        </w:rPr>
+        <w:t xml:space="preserve">Leçon de la session v26.35, à retenir absolument. Le premier test hors ligne a échoué (ERR_INTERNET_DISCONNECTED, service worker sans réponse) et a fait croire à un correctif raté. La cause n’était pas le code : en navigation InPrivate, le stockage du service worker est éphémère et le cache ne persiste pas. C’est le principe même de la navigation privée.</w:t>
+      </w:r>
+    </w:p>
+    <w:p>
+      <w:pPr>
+        <w:pStyle w:val="Corpsdetexte"/>
+      </w:pPr>
+      <w:r>
+        <w:rPr>
+          <w:lang w:val="fr-BF"/>
+        </w:rPr>
+        <w:t xml:space="preserve">Conséquence sur les protocoles de test de la Bible : InPrivate reste recommandé pour vérifier qu’une NOUVELLE VERSION est bien déployée (il contourne le cache). Mais il est inadapté pour tester le cache lui-même. Les deux usages sont opposés — ne pas les confondre.</w:t>
+      </w:r>
+    </w:p>
+    <w:p>
+      <w:pPr>
+        <w:pStyle w:val="Corpsdetexte"/>
+      </w:pPr>
+      <w:r>
+        <w:rPr>
+          <w:b/>
+          <w:bCs/>
+          <w:lang w:val="fr-BF"/>
+        </w:rPr>
+        <w:t xml:space="preserve">Protocole de test du cache (fenêtre NORMALE obligatoire) :</w:t>
+      </w:r>
+    </w:p>
+    <w:p>
+      <w:pPr>
+        <w:pStyle w:val="Corpsdetexte"/>
+      </w:pPr>
+      <w:r>
+        <w:rPr>
+          <w:lang w:val="fr-BF"/>
+        </w:rPr>
+        <w:t xml:space="preserve">1) Fenêtre Edge ordinaire, charger l’app et laisser le chargement se terminer. 2) F12 → Application → Service Workers : vérifier « activated and running ». 3) F12 → Application → Cache Storage → avigest-v26-XX : compter les entrées. 4) Network → Offline → F5 : l’app doit s’afficher.</w:t>
+      </w:r>
+    </w:p>
+    <w:p>
+      <w:pPr>
+        <w:pStyle w:val="Corpsdetexte"/>
+      </w:pPr>
+      <w:r>
+        <w:rPr>
+          <w:lang w:val="fr-BF"/>
+        </w:rPr>
+        <w:t xml:space="preserve">Contrôle rapide en console, plus fiable que la navigation dans les panneaux :</w:t>
+      </w:r>
+    </w:p>
+    <w:p>
+      <w:pPr>
+        <w:pStyle w:val="SourceCode"/>
+      </w:pPr>
+      <w:r>
+        <w:rPr>
+          <w:rStyle w:val="VerbatimChar"/>
+          <w:lang w:val="fr-BF"/>
+        </w:rPr>
+        <w:t xml:space="preserve">(await (await caches.open('avigest-v26-35')).keys()).length</w:t>
+      </w:r>
+    </w:p>
+    <w:p>
+      <w:pPr>
+        <w:pStyle w:val="Corpsdetexte"/>
+      </w:pPr>
+      <w:r>
+        <w:rPr>
+          <w:lang w:val="fr-BF"/>
+        </w:rPr>
+        <w:t xml:space="preserve">⚠️ Un nouveau service worker peut demander DEUX chargements avant de prendre le relais (le premier installe, le second active), même avec skipWaiting().</w:t>
+      </w:r>
+    </w:p>
+    <w:p>
+      <w:pPr>
+        <w:pStyle w:val="Titre3"/>
+      </w:pPr>
+      <w:r>
+        <w:rPr>
+          <w:b/>
+          <w:bCs/>
+          <w:lang w:val="fr-BF"/>
+        </w:rPr>
+        <w:t xml:space="preserve">21.5 Résultat mesuré en production (23/07/2026)</w:t>
+      </w:r>
+    </w:p>
+    <w:p>
+      <w:pPr>
+        <w:pStyle w:val="Corpsdetexte"/>
+      </w:pPr>
+      <w:r>
+        <w:rPr>
+          <w:lang w:val="fr-BF"/>
+        </w:rPr>
+        <w:t xml:space="preserve">Cache avigest-v26-35 : 10 entrées. Les 9 de STATIC_URLS, plus une entrée ajoutée automatiquement par la stratégie fetch (ressource chargée au démarrage). Les 7 modules se chargent tous en statut 200, aucun 404. App testée hors ligne en fenêtre normale : l’écran d’accueil s’affiche.</w:t>
+      </w:r>
+    </w:p>
+    <w:p>
+      <w:pPr>
+        <w:pStyle w:val="Corpsdetexte"/>
+      </w:pPr>
+      <w:r>
+        <w:rPr>
+          <w:b/>
+          <w:bCs/>
+          <w:lang w:val="fr-BF"/>
+        </w:rPr>
+        <w:t xml:space="preserve">⚠️ Ce qui NE fonctionne toujours pas hors ligne, et c’est normal : les DONNÉES. Tous les appels Supabase échouent sans réseau. Ce chantier rend l’INTERFACE disponible hors ligne, pas les données. Le vrai mode offline (file d’attente localStorage + synchronisation) reste à faire — voir §13.2, ligne « Mode hors ligne + sync auto ».</w:t>
+      </w:r>
+    </w:p>
+    <w:p>
+      <w:pPr>
+        <w:pStyle w:val="Corpsdetexte"/>
+      </w:pPr>
+      <w:r>
+        <w:rPr>
+          <w:lang w:val="fr-BF"/>
+        </w:rPr>
+        <w:t xml:space="preserve">💡 En clair : l’agent qui perd le réseau voit maintenant son écran au lieu d’une page blanche. Mais il ne voit pas ses chiffres — ceux-là viennent du serveur. Rendre les chiffres disponibles hors ligne, c’est un autre chantier, plus gros.</w:t>
       </w:r>
     </w:p>
     <w:p>

</xml_diff>

<commit_message>
Diff ~298 lignes = 1 changement sémantique (ligne "Clôture bande" du   tableau PROCESSUS, ○ À faire → ✅ Validé) + reformatage pandoc 3.10   (indentation listes). Séparateurs --- = traits Word réels. Nouveau   baseline .md ; régénérations futures propres.
</commit_message>
<xml_diff>
--- a/bible_avigest_v26.docx
+++ b/bible_avigest_v26.docx
@@ -9941,9 +9941,9 @@
         <w:tblLook w:val="0020" w:firstRow="1" w:lastRow="0" w:firstColumn="0" w:lastColumn="0" w:noHBand="0" w:noVBand="0"/>
       </w:tblPr>
       <w:tblGrid>
-        <w:gridCol w:w="4497"/>
-        <w:gridCol w:w="1430"/>
-        <w:gridCol w:w="3695"/>
+        <w:gridCol w:w="3951"/>
+        <w:gridCol w:w="1434"/>
+        <w:gridCol w:w="4237"/>
       </w:tblGrid>
       <w:tr>
         <w:trPr>
@@ -10013,20 +10013,32 @@
               <w:pStyle w:val="Compact"/>
             </w:pPr>
             <w:r>
-              <w:t>○ À faire</w:t>
-            </w:r>
-          </w:p>
-        </w:tc>
-        <w:tc>
-          <w:tcPr>
-            <w:tcW w:w="0" w:type="auto"/>
-          </w:tcPr>
-          <w:p>
-            <w:pPr>
-              <w:pStyle w:val="Compact"/>
-            </w:pPr>
-            <w:r>
-              <w:t>14 jours minimum</w:t>
+              <w:rPr>
+                <w:rFonts w:ascii="Segoe UI Emoji" w:hAnsi="Segoe UI Emoji" w:cs="Segoe UI Emoji"/>
+              </w:rPr>
+              <w:t>✅</w:t>
+            </w:r>
+            <w:r>
+              <w:t xml:space="preserve"> </w:t>
+            </w:r>
+            <w:r>
+              <w:rPr>
+                <w:lang w:val="fr-FR"/>
+              </w:rPr>
+              <w:t>Validé</w:t>
+            </w:r>
+          </w:p>
+        </w:tc>
+        <w:tc>
+          <w:tcPr>
+            <w:tcW w:w="0" w:type="auto"/>
+          </w:tcPr>
+          <w:p>
+            <w:pPr>
+              <w:pStyle w:val="Compact"/>
+            </w:pPr>
+            <w:r>
+              <w:t>Clos v26.21 — voir §15 (14 j min)</w:t>
             </w:r>
           </w:p>
         </w:tc>

</xml_diff>